<commit_message>
todo: finish the user documentation about the goal of the application.
</commit_message>
<xml_diff>
--- a/acs_bcs_rj_dokumentáció_stage3.docx
+++ b/acs_bcs_rj_dokumentáció_stage3.docx
@@ -2502,8 +2502,6 @@
         </w:rPr>
         <w:t xml:space="preserve"> felületen keresztül</w:t>
       </w:r>
-      <w:bookmarkStart w:id="4" w:name="_GoBack"/>
-      <w:bookmarkEnd w:id="4"/>
       <w:r>
         <w:rPr>
           <w:rFonts w:cs="Times New Roman"/>
@@ -2834,11 +2832,11 @@
           <w:numId w:val="4"/>
         </w:numPr>
       </w:pPr>
-      <w:bookmarkStart w:id="5" w:name="_Toc184887502"/>
+      <w:bookmarkStart w:id="4" w:name="_Toc184887502"/>
       <w:r>
         <w:t>Az alkalmazott fejlesztői eszközök</w:t>
       </w:r>
-      <w:bookmarkEnd w:id="5"/>
+      <w:bookmarkEnd w:id="4"/>
     </w:p>
     <w:p>
       <w:pPr>
@@ -3697,12 +3695,12 @@
           <w:numId w:val="4"/>
         </w:numPr>
       </w:pPr>
-      <w:bookmarkStart w:id="6" w:name="_Toc184887503"/>
+      <w:bookmarkStart w:id="5" w:name="_Toc184887503"/>
       <w:r>
         <w:lastRenderedPageBreak/>
         <w:t>Adatmodell leírása</w:t>
       </w:r>
-      <w:bookmarkEnd w:id="6"/>
+      <w:bookmarkEnd w:id="5"/>
     </w:p>
     <w:p>
       <w:r>
@@ -9378,7 +9376,7 @@
           <w:numId w:val="4"/>
         </w:numPr>
       </w:pPr>
-      <w:bookmarkStart w:id="7" w:name="_Toc184887504"/>
+      <w:bookmarkStart w:id="6" w:name="_Toc184887504"/>
       <w:r>
         <w:lastRenderedPageBreak/>
         <w:t>A</w:t>
@@ -9386,7 +9384,7 @@
       <w:r>
         <w:t>lgoritmusok</w:t>
       </w:r>
-      <w:bookmarkEnd w:id="7"/>
+      <w:bookmarkEnd w:id="6"/>
     </w:p>
     <w:p>
       <w:pPr>
@@ -12383,7 +12381,7 @@
         </w:rPr>
         <w:t>Sikeres vagy hibaüzenetet ad vissza</w:t>
       </w:r>
-      <w:bookmarkStart w:id="8" w:name="_Toc184887505"/>
+      <w:bookmarkStart w:id="7" w:name="_Toc184887505"/>
       <w:r>
         <w:br w:type="page"/>
       </w:r>
@@ -12400,7 +12398,7 @@
         <w:lastRenderedPageBreak/>
         <w:t>Tesztelési dokumentáció</w:t>
       </w:r>
-      <w:bookmarkEnd w:id="8"/>
+      <w:bookmarkEnd w:id="7"/>
     </w:p>
     <w:p>
       <w:pPr>
@@ -12974,7 +12972,9 @@
       <w:r>
         <w:rPr>
           <w:rFonts w:cs="Times New Roman"/>
-          <w:szCs w:val="24"/>
+          <w:b/>
+          <w:sz w:val="26"/>
+          <w:szCs w:val="26"/>
         </w:rPr>
         <w:lastRenderedPageBreak/>
         <w:t>A</w:t>
@@ -12982,14 +12982,18 @@
       <w:r>
         <w:rPr>
           <w:rFonts w:cs="Times New Roman"/>
-          <w:szCs w:val="24"/>
-        </w:rPr>
-        <w:t xml:space="preserve"> </w:t>
-      </w:r>
-      <w:r>
-        <w:rPr>
-          <w:rFonts w:cs="Times New Roman"/>
-          <w:szCs w:val="24"/>
+          <w:b/>
+          <w:sz w:val="26"/>
+          <w:szCs w:val="26"/>
+        </w:rPr>
+        <w:t xml:space="preserve"> </w:t>
+      </w:r>
+      <w:r>
+        <w:rPr>
+          <w:rFonts w:cs="Times New Roman"/>
+          <w:b/>
+          <w:sz w:val="26"/>
+          <w:szCs w:val="26"/>
         </w:rPr>
         <w:t>tesztelés során kiderült hibák</w:t>
       </w:r>
@@ -13355,18 +13359,22 @@
           <w:rFonts w:cs="Times New Roman"/>
           <w:szCs w:val="24"/>
         </w:rPr>
-        <w:t xml:space="preserve">, és beírja a helyes URL-t a böngésző címsorába </w:t>
+        <w:t>, és beírja a helyes URL-t a böngésző címsorába</w:t>
+      </w:r>
+      <w:bookmarkStart w:id="8" w:name="_Toc184887506"/>
+      <w:r>
+        <w:br w:type="page"/>
       </w:r>
     </w:p>
     <w:p>
       <w:pPr>
         <w:pStyle w:val="Cmsor1"/>
       </w:pPr>
-      <w:bookmarkStart w:id="9" w:name="_Toc184887506"/>
-      <w:r>
+      <w:r>
+        <w:lastRenderedPageBreak/>
         <w:t>Felhasználói dokumentáció</w:t>
       </w:r>
-      <w:bookmarkEnd w:id="9"/>
+      <w:bookmarkEnd w:id="8"/>
     </w:p>
     <w:p>
       <w:pPr>
@@ -13376,29 +13384,41 @@
           <w:numId w:val="9"/>
         </w:numPr>
       </w:pPr>
-      <w:bookmarkStart w:id="10" w:name="_Toc184887507"/>
-      <w:r>
-        <w:t>A program általános specifikációja</w:t>
-      </w:r>
-      <w:r>
-        <w:t>, célja</w:t>
-      </w:r>
+      <w:bookmarkStart w:id="9" w:name="_Toc184887507"/>
+      <w:r>
+        <w:t xml:space="preserve">A program </w:t>
+      </w:r>
+      <w:bookmarkEnd w:id="9"/>
+      <w:r>
+        <w:t>célja</w:t>
+      </w:r>
+    </w:p>
+    <w:p>
+      <w:r>
+        <w:t>A program lényege</w:t>
+      </w:r>
+      <w:r>
+        <w:t>,</w:t>
+      </w:r>
+      <w:r>
+        <w:t xml:space="preserve"> </w:t>
+      </w:r>
+      <w:r>
+        <w:t>hogy a felhasználó megtalálja a számára legmegfelelőbb éttermet mind táplálkozás mind</w:t>
+      </w:r>
+      <w:r>
+        <w:t xml:space="preserve"> földrajzi elhelyezkedés szempontjából</w:t>
+      </w:r>
+      <w:r>
+        <w:t>.</w:t>
+      </w:r>
+      <w:r>
+        <w:t xml:space="preserve"> </w:t>
+      </w:r>
+      <w:bookmarkStart w:id="10" w:name="_GoBack"/>
       <w:bookmarkEnd w:id="10"/>
-    </w:p>
-    <w:p>
-      <w:r>
-        <w:t>Ez a rész a program fontosabb jellemzőit és funkcióit tartalmazza. A cél, hogy a leendő felhasználó ezt a fejezetet elolvasva el tudja dönteni, hogy a program megfelelő-e a számára.</w:t>
-      </w:r>
-    </w:p>
-    <w:p>
-      <w:r>
-        <w:t xml:space="preserve">Ajánlott terjedelem: </w:t>
-      </w:r>
-      <w:r>
-        <w:t>½ -1 oldal</w:t>
-      </w:r>
-      <w:r>
-        <w:t>.</w:t>
+      <w:r>
+        <w:t xml:space="preserve"> </w:t>
       </w:r>
     </w:p>
     <w:p>
@@ -13416,66 +13436,73 @@
       <w:bookmarkEnd w:id="11"/>
     </w:p>
     <w:p>
-      <w:r>
+      <w:pPr>
+        <w:rPr>
+          <w:b/>
+        </w:rPr>
+      </w:pPr>
+      <w:r>
+        <w:rPr>
+          <w:b/>
+        </w:rPr>
         <w:t>Hardver követelmények</w:t>
       </w:r>
     </w:p>
     <w:p>
       <w:r>
-        <w:t>Ebben a részben kell leírni a minimális és ajánlott hardver konfigurációt, amely a program futtatásához szükséges. Pontos paramétereket kell megadni, még akkor is, ha a program amúgy minden gépen lefut.</w:t>
-      </w:r>
-    </w:p>
-    <w:p>
-      <w:r>
+        <w:t>A program futtatásához egy modern webböngészőre van szükség.</w:t>
+      </w:r>
+      <w:r>
+        <w:t xml:space="preserve"> </w:t>
+      </w:r>
+      <w:r>
+        <w:t xml:space="preserve">Ez lehet Chrome, Firefox, </w:t>
+      </w:r>
+      <w:proofErr w:type="spellStart"/>
+      <w:r>
+        <w:t>Safari</w:t>
+      </w:r>
+      <w:proofErr w:type="spellEnd"/>
+      <w:r>
+        <w:t>, vagy bármi más.</w:t>
+      </w:r>
+      <w:r>
+        <w:t xml:space="preserve"> </w:t>
+      </w:r>
+    </w:p>
+    <w:p>
+      <w:pPr>
+        <w:rPr>
+          <w:b/>
+        </w:rPr>
+      </w:pPr>
+      <w:r>
+        <w:rPr>
+          <w:b/>
+        </w:rPr>
         <w:t>Szoftver követelmények</w:t>
       </w:r>
     </w:p>
     <w:p>
       <w:r>
-        <w:t>Le kell írni, hogy mely operációs rendszere(</w:t>
-      </w:r>
-      <w:proofErr w:type="spellStart"/>
-      <w:r>
-        <w:t>ke</w:t>
-      </w:r>
-      <w:proofErr w:type="spellEnd"/>
-      <w:r>
-        <w:t xml:space="preserve">)n fut a program, és milyen egyéb szoftver komponensek szükségesek a működéshez (pl. .NET, </w:t>
-      </w:r>
-      <w:proofErr w:type="spellStart"/>
-      <w:r>
-        <w:t>DirectX</w:t>
-      </w:r>
-      <w:proofErr w:type="spellEnd"/>
-      <w:r>
-        <w:t>, esetleg adatbázis-szerver és adatbázis-</w:t>
-      </w:r>
-      <w:proofErr w:type="gramStart"/>
-      <w:r>
-        <w:t>állományok,</w:t>
-      </w:r>
-      <w:proofErr w:type="gramEnd"/>
-      <w:r>
-        <w:t xml:space="preserve"> stb.) </w:t>
-      </w:r>
-    </w:p>
-    <w:p>
-      <w:r>
-        <w:t>Ajánlott terjedelem: ½ -1 oldal, felsorolá</w:t>
-      </w:r>
-      <w:r>
-        <w:t>s</w:t>
-      </w:r>
-      <w:r>
-        <w:t xml:space="preserve"> </w:t>
-      </w:r>
-      <w:proofErr w:type="spellStart"/>
-      <w:r>
-        <w:t>szerűen</w:t>
-      </w:r>
-      <w:proofErr w:type="spellEnd"/>
-      <w:r>
-        <w:t xml:space="preserve"> leírva</w:t>
+        <w:t xml:space="preserve">A program működéséhez egy Operációs Rendszer szükséges, ami képes modern Webböngészők futtatására. Emellett szükséges </w:t>
+      </w:r>
+      <w:r>
+        <w:t xml:space="preserve">egy e-mail fiók, </w:t>
+      </w:r>
+      <w:proofErr w:type="spellStart"/>
+      <w:r>
+        <w:t>pl</w:t>
+      </w:r>
+      <w:proofErr w:type="spellEnd"/>
+      <w:r>
+        <w:t xml:space="preserve"> </w:t>
+      </w:r>
+      <w:r>
+        <w:t>Gmail</w:t>
+      </w:r>
+      <w:r>
+        <w:t>, Freemail, vagy bármi más.</w:t>
       </w:r>
     </w:p>
     <w:p>
@@ -13512,85 +13539,85 @@
     </w:p>
     <w:p>
       <w:r>
+        <w:t>•</w:t>
+      </w:r>
+      <w:r>
+        <w:tab/>
+        <w:t>Ha esetleg nincs telepítőprogram, akkor kellő részletességgel le kell írni, hogy mely fájlokat, pontosan hova kell felmásolni, és hogy lehet a programot futtatni.</w:t>
+      </w:r>
+    </w:p>
+    <w:p>
+      <w:r>
+        <w:t xml:space="preserve">Ajánlott terjedelem: </w:t>
+      </w:r>
+      <w:r>
+        <w:t>1-</w:t>
+      </w:r>
+      <w:r>
+        <w:t>3</w:t>
+      </w:r>
+      <w:r>
+        <w:t xml:space="preserve"> oldal, ábrákkal együtt.</w:t>
+      </w:r>
+    </w:p>
+    <w:p>
+      <w:pPr>
+        <w:pStyle w:val="Cmsor2"/>
+        <w:numPr>
+          <w:ilvl w:val="0"/>
+          <w:numId w:val="9"/>
+        </w:numPr>
+      </w:pPr>
+      <w:bookmarkStart w:id="13" w:name="_Toc184887510"/>
+      <w:r>
+        <w:t>A program használatának a részletes leírása</w:t>
+      </w:r>
+      <w:bookmarkEnd w:id="13"/>
+    </w:p>
+    <w:p>
+      <w:r>
+        <w:t>Mindenre kiterjedő, részletes leírás a program használatáról.</w:t>
+      </w:r>
+    </w:p>
+    <w:p>
+      <w:r>
+        <w:t>Alapszabályok:</w:t>
+      </w:r>
+    </w:p>
+    <w:p>
+      <w:r>
+        <w:t>•</w:t>
+      </w:r>
+      <w:r>
+        <w:tab/>
+        <w:t>Amit leprogramoztál, azt a dokumentációban írd is le, ne legyenek eltitkolt funkciók.</w:t>
+      </w:r>
+    </w:p>
+    <w:p>
+      <w:r>
+        <w:t>•</w:t>
+      </w:r>
+      <w:r>
+        <w:tab/>
+        <w:t>Minden pontosan, „szájbarágósan” legyen leírva. A dokumentáció alapján a teljesen kezdő, vagy laikus felhasználóknak is használniuk kell tudni a programot.</w:t>
+      </w:r>
+    </w:p>
+    <w:p>
+      <w:r>
+        <w:t>•</w:t>
+      </w:r>
+      <w:r>
+        <w:tab/>
+        <w:t>A stílus legyen pontos és közérthető, vedd figyelembe, hogy a felhasználói dokumentáció nem szakembereknek készül.</w:t>
+      </w:r>
+    </w:p>
+    <w:p>
+      <w:r>
         <w:lastRenderedPageBreak/>
         <w:t>•</w:t>
       </w:r>
       <w:r>
         <w:tab/>
-        <w:t>Ha esetleg nincs telepítőprogram, akkor kellő részletességgel le kell írni, hogy mely fájlokat, pontosan hova kell felmásolni, és hogy lehet a programot futtatni.</w:t>
-      </w:r>
-    </w:p>
-    <w:p>
-      <w:r>
-        <w:t xml:space="preserve">Ajánlott terjedelem: </w:t>
-      </w:r>
-      <w:r>
-        <w:t>1-</w:t>
-      </w:r>
-      <w:r>
-        <w:t>3</w:t>
-      </w:r>
-      <w:r>
-        <w:t xml:space="preserve"> oldal, ábrákkal együtt.</w:t>
-      </w:r>
-    </w:p>
-    <w:p>
-      <w:pPr>
-        <w:pStyle w:val="Cmsor2"/>
-        <w:numPr>
-          <w:ilvl w:val="0"/>
-          <w:numId w:val="9"/>
-        </w:numPr>
-      </w:pPr>
-      <w:bookmarkStart w:id="13" w:name="_Toc184887510"/>
-      <w:r>
-        <w:t>A program használatának a részletes leírása</w:t>
-      </w:r>
-      <w:bookmarkEnd w:id="13"/>
-    </w:p>
-    <w:p>
-      <w:r>
-        <w:t>Mindenre kiterjedő, részletes leírás a program használatáról.</w:t>
-      </w:r>
-    </w:p>
-    <w:p>
-      <w:r>
-        <w:t>Alapszabályok:</w:t>
-      </w:r>
-    </w:p>
-    <w:p>
-      <w:r>
-        <w:t>•</w:t>
-      </w:r>
-      <w:r>
-        <w:tab/>
-        <w:t>Amit leprogramoztál, azt a dokumentációban írd is le, ne legyenek eltitkolt funkciók.</w:t>
-      </w:r>
-    </w:p>
-    <w:p>
-      <w:r>
-        <w:t>•</w:t>
-      </w:r>
-      <w:r>
-        <w:tab/>
-        <w:t>Minden pontosan, „szájbarágósan” legyen leírva. A dokumentáció alapján a teljesen kezdő, vagy laikus felhasználóknak is használniuk kell tudni a programot.</w:t>
-      </w:r>
-    </w:p>
-    <w:p>
-      <w:r>
-        <w:t>•</w:t>
-      </w:r>
-      <w:r>
-        <w:tab/>
-        <w:t>A stílus legyen pontos és közérthető, vedd figyelembe, hogy a felhasználói dokumentáció nem szakembereknek készül.</w:t>
-      </w:r>
-    </w:p>
-    <w:p>
-      <w:r>
-        <w:t>•</w:t>
-      </w:r>
-      <w:r>
-        <w:tab/>
         <w:t xml:space="preserve">Ugyanakkor kerüld a laza stílust: rövidítések, </w:t>
       </w:r>
       <w:proofErr w:type="spellStart"/>
@@ -13697,7 +13724,6 @@
         <w:rPr>
           <w:noProof/>
         </w:rPr>
-        <w:lastRenderedPageBreak/>
         <w:drawing>
           <wp:inline distT="0" distB="0" distL="0" distR="0" wp14:anchorId="39A063CE" wp14:editId="0C4C6F25">
             <wp:extent cx="5580380" cy="4285615"/>
@@ -13753,6 +13779,7 @@
     <w:p>
       <w:proofErr w:type="spellStart"/>
       <w:r>
+        <w:lastRenderedPageBreak/>
         <w:t>pl</w:t>
       </w:r>
       <w:proofErr w:type="spellEnd"/>
@@ -15759,6 +15786,7 @@
   <w:style w:type="character" w:default="1" w:styleId="Bekezdsalapbettpusa">
     <w:name w:val="Default Paragraph Font"/>
     <w:uiPriority w:val="1"/>
+    <w:semiHidden/>
     <w:unhideWhenUsed/>
   </w:style>
   <w:style w:type="table" w:default="1" w:styleId="Normltblzat">
@@ -16168,15 +16196,6 @@
 </file>
 
 <file path=customXml/item1.xml><?xml version="1.0" encoding="utf-8"?>
-<?mso-contentType ?>
-<FormTemplates xmlns="http://schemas.microsoft.com/sharepoint/v3/contenttype/forms">
-  <Display>DocumentLibraryForm</Display>
-  <Edit>DocumentLibraryForm</Edit>
-  <New>DocumentLibraryForm</New>
-</FormTemplates>
-</file>
-
-<file path=customXml/item2.xml><?xml version="1.0" encoding="utf-8"?>
 <ct:contentTypeSchema xmlns:ct="http://schemas.microsoft.com/office/2006/metadata/contentType" xmlns:ma="http://schemas.microsoft.com/office/2006/metadata/properties/metaAttributes" ct:_="" ma:_="" ma:contentTypeName="Dokumentum" ma:contentTypeID="0x010100D718D5B1F1F7ED478AB81686C56B3846" ma:contentTypeVersion="12" ma:contentTypeDescription="Új dokumentum létrehozása." ma:contentTypeScope="" ma:versionID="4113051e3749f108762f491873dd6f4a">
   <xsd:schema xmlns:xsd="http://www.w3.org/2001/XMLSchema" xmlns:xs="http://www.w3.org/2001/XMLSchema" xmlns:p="http://schemas.microsoft.com/office/2006/metadata/properties" xmlns:ns2="8147ea79-bac0-4e82-8ac5-0eadccd741d2" xmlns:ns3="60255030-76c1-42c3-809c-3af475a77e4b" targetNamespace="http://schemas.microsoft.com/office/2006/metadata/properties" ma:root="true" ma:fieldsID="b4ef00bff07f7ef5464b0f4fcee0641e" ns2:_="" ns3:_="">
     <xsd:import namespace="8147ea79-bac0-4e82-8ac5-0eadccd741d2"/>
@@ -16377,6 +16396,15 @@
 </ct:contentTypeSchema>
 </file>
 
+<file path=customXml/item2.xml><?xml version="1.0" encoding="utf-8"?>
+<?mso-contentType ?>
+<FormTemplates xmlns="http://schemas.microsoft.com/sharepoint/v3/contenttype/forms">
+  <Display>DocumentLibraryForm</Display>
+  <Edit>DocumentLibraryForm</Edit>
+  <New>DocumentLibraryForm</New>
+</FormTemplates>
+</file>
+
 <file path=customXml/item3.xml><?xml version="1.0" encoding="utf-8"?>
 <p:properties xmlns:p="http://schemas.microsoft.com/office/2006/metadata/properties" xmlns:xsi="http://www.w3.org/2001/XMLSchema-instance" xmlns:pc="http://schemas.microsoft.com/office/infopath/2007/PartnerControls">
   <documentManagement>
@@ -16394,14 +16422,6 @@
 </file>
 
 <file path=customXml/itemProps1.xml><?xml version="1.0" encoding="utf-8"?>
-<ds:datastoreItem xmlns:ds="http://schemas.openxmlformats.org/officeDocument/2006/customXml" ds:itemID="{79A7C881-0E9F-4ADE-9952-CE895C263EC3}">
-  <ds:schemaRefs>
-    <ds:schemaRef ds:uri="http://schemas.microsoft.com/sharepoint/v3/contenttype/forms"/>
-  </ds:schemaRefs>
-</ds:datastoreItem>
-</file>
-
-<file path=customXml/itemProps2.xml><?xml version="1.0" encoding="utf-8"?>
 <ds:datastoreItem xmlns:ds="http://schemas.openxmlformats.org/officeDocument/2006/customXml" ds:itemID="{506CB0D4-5899-457C-99D1-371F2417467A}">
   <ds:schemaRefs>
     <ds:schemaRef ds:uri="http://schemas.microsoft.com/office/2006/metadata/contentType"/>
@@ -16420,6 +16440,14 @@
 </ds:datastoreItem>
 </file>
 
+<file path=customXml/itemProps2.xml><?xml version="1.0" encoding="utf-8"?>
+<ds:datastoreItem xmlns:ds="http://schemas.openxmlformats.org/officeDocument/2006/customXml" ds:itemID="{79A7C881-0E9F-4ADE-9952-CE895C263EC3}">
+  <ds:schemaRefs>
+    <ds:schemaRef ds:uri="http://schemas.microsoft.com/sharepoint/v3/contenttype/forms"/>
+  </ds:schemaRefs>
+</ds:datastoreItem>
+</file>
+
 <file path=customXml/itemProps3.xml><?xml version="1.0" encoding="utf-8"?>
 <ds:datastoreItem xmlns:ds="http://schemas.openxmlformats.org/officeDocument/2006/customXml" ds:itemID="{B7E9051D-122B-41E4-9B50-07EAFD04DFCF}">
   <ds:schemaRefs>
@@ -16432,7 +16460,7 @@
 </file>
 
 <file path=customXml/itemProps4.xml><?xml version="1.0" encoding="utf-8"?>
-<ds:datastoreItem xmlns:ds="http://schemas.openxmlformats.org/officeDocument/2006/customXml" ds:itemID="{DBFA8D3A-2370-4464-A564-CB5766B81287}">
+<ds:datastoreItem xmlns:ds="http://schemas.openxmlformats.org/officeDocument/2006/customXml" ds:itemID="{DFE88C67-CCA6-4BFB-B887-DC98F7105CE2}">
   <ds:schemaRefs>
     <ds:schemaRef ds:uri="http://schemas.openxmlformats.org/officeDocument/2006/bibliography"/>
   </ds:schemaRefs>

</xml_diff>

<commit_message>
todo: program használatának leírása, ábrajegyzék, meg valami kódrészlet a dokumentációba
</commit_message>
<xml_diff>
--- a/acs_bcs_rj_dokumentáció_stage3.docx
+++ b/acs_bcs_rj_dokumentáció_stage3.docx
@@ -13394,31 +13394,260 @@
       </w:r>
     </w:p>
     <w:p>
-      <w:r>
-        <w:t>A program lényege</w:t>
-      </w:r>
-      <w:r>
-        <w:t>,</w:t>
+      <w:bookmarkStart w:id="10" w:name="_Toc184887508"/>
+      <w:r>
+        <w:t xml:space="preserve">A </w:t>
+      </w:r>
+      <w:proofErr w:type="spellStart"/>
+      <w:r>
+        <w:t>Nutri</w:t>
+      </w:r>
+      <w:proofErr w:type="spellEnd"/>
+      <w:r>
+        <w:t xml:space="preserve"> applikáció célja, hogy segítse a felhasználókat a számukra legmegfelelőbb ételek és éttermek kiválasztásában, táplálkozási szokásaik és földrajzi elhelyezkedésük alapján. Az alkalmazás átláthatóan jeleníti meg az ételek összetevőit, </w:t>
+      </w:r>
+      <w:proofErr w:type="spellStart"/>
+      <w:r>
+        <w:t>makrotápanyag</w:t>
+      </w:r>
+      <w:proofErr w:type="spellEnd"/>
+      <w:r>
+        <w:t>-tartalmát, allergén-információkat, és veszélyességi szintjeit. Lehetőséget nyújt a felhasználóknak arra is, hogy új ételeket töltsenek fel, javaslatokat tegyenek, vagy hozzájáruljanak a már meglévő adatbázis</w:t>
       </w:r>
       <w:r>
         <w:t xml:space="preserve"> </w:t>
       </w:r>
       <w:r>
-        <w:t>hogy a felhasználó megtalálja a számára legmegfelelőbb éttermet mind táplálkozás mind</w:t>
-      </w:r>
-      <w:r>
-        <w:t xml:space="preserve"> földrajzi elhelyezkedés szempontjából</w:t>
-      </w:r>
-      <w:r>
-        <w:t>.</w:t>
+        <w:t>bővítéséhez.</w:t>
       </w:r>
       <w:r>
         <w:t xml:space="preserve"> </w:t>
       </w:r>
-      <w:bookmarkStart w:id="10" w:name="_GoBack"/>
+      <w:r>
+        <w:t>A rendszer célja az átláthatóság, a közösségi adatrögzítés támogatása,</w:t>
+      </w:r>
+      <w:r>
+        <w:t xml:space="preserve"> </w:t>
+      </w:r>
+      <w:r>
+        <w:t>valamint</w:t>
+      </w:r>
+      <w:r>
+        <w:t xml:space="preserve"> </w:t>
+      </w:r>
+      <w:r>
+        <w:t xml:space="preserve">a </w:t>
+      </w:r>
+      <w:proofErr w:type="gramStart"/>
+      <w:r>
+        <w:t xml:space="preserve">felhasználók </w:t>
+      </w:r>
+      <w:r>
+        <w:t xml:space="preserve"> </w:t>
+      </w:r>
+      <w:r>
+        <w:t>táplálkozási</w:t>
+      </w:r>
+      <w:proofErr w:type="gramEnd"/>
+      <w:r>
+        <w:t xml:space="preserve"> döntéseinek</w:t>
+      </w:r>
+      <w:r>
+        <w:t xml:space="preserve"> </w:t>
+      </w:r>
+      <w:r>
+        <w:t>elősegítése.</w:t>
+      </w:r>
       <w:bookmarkEnd w:id="10"/>
-      <w:r>
-        <w:t xml:space="preserve"> </w:t>
+    </w:p>
+    <w:p>
+      <w:pPr>
+        <w:rPr>
+          <w:b/>
+        </w:rPr>
+      </w:pPr>
+      <w:r>
+        <w:rPr>
+          <w:b/>
+        </w:rPr>
+        <w:t>Hardver követelmények</w:t>
+      </w:r>
+    </w:p>
+    <w:p>
+      <w:pPr>
+        <w:pStyle w:val="Listaszerbekezds"/>
+        <w:numPr>
+          <w:ilvl w:val="0"/>
+          <w:numId w:val="17"/>
+        </w:numPr>
+      </w:pPr>
+      <w:r>
+        <w:t xml:space="preserve">A </w:t>
+      </w:r>
+      <w:proofErr w:type="spellStart"/>
+      <w:r>
+        <w:t>Nutri</w:t>
+      </w:r>
+      <w:proofErr w:type="spellEnd"/>
+      <w:r>
+        <w:t xml:space="preserve"> applikáció egy webalapú rendszer, így külön telepítésre nincs szükség.</w:t>
+      </w:r>
+    </w:p>
+    <w:p>
+      <w:pPr>
+        <w:pStyle w:val="Listaszerbekezds"/>
+        <w:numPr>
+          <w:ilvl w:val="0"/>
+          <w:numId w:val="17"/>
+        </w:numPr>
+      </w:pPr>
+      <w:r>
+        <w:t>Futtatásához egy modern számítógépre, laptopra vagy okoseszközre van szükség, amely képes korszerű webböngészőket használni.</w:t>
+      </w:r>
+    </w:p>
+    <w:p>
+      <w:pPr>
+        <w:pStyle w:val="Listaszerbekezds"/>
+        <w:numPr>
+          <w:ilvl w:val="0"/>
+          <w:numId w:val="17"/>
+        </w:numPr>
+      </w:pPr>
+      <w:r>
+        <w:t xml:space="preserve">Minimum 2 GB RAM és 1 </w:t>
+      </w:r>
+      <w:proofErr w:type="spellStart"/>
+      <w:r>
+        <w:t>GHz</w:t>
+      </w:r>
+      <w:proofErr w:type="spellEnd"/>
+      <w:r>
+        <w:t>-es processzor javasolt a zökkenőmentes működéshez.</w:t>
+      </w:r>
+    </w:p>
+    <w:p>
+      <w:pPr>
+        <w:rPr>
+          <w:b/>
+        </w:rPr>
+      </w:pPr>
+      <w:r>
+        <w:rPr>
+          <w:b/>
+        </w:rPr>
+        <w:t>Szoftver követelmények</w:t>
+      </w:r>
+    </w:p>
+    <w:p>
+      <w:pPr>
+        <w:pStyle w:val="Listaszerbekezds"/>
+        <w:numPr>
+          <w:ilvl w:val="0"/>
+          <w:numId w:val="18"/>
+        </w:numPr>
+      </w:pPr>
+      <w:r>
+        <w:rPr>
+          <w:rStyle w:val="Kiemels2"/>
+        </w:rPr>
+        <w:t>Böngészők</w:t>
+      </w:r>
+      <w:r>
+        <w:t xml:space="preserve">: Google Chrome, Mozilla Firefox, Microsoft Edge, </w:t>
+      </w:r>
+      <w:proofErr w:type="spellStart"/>
+      <w:r>
+        <w:t>Safari</w:t>
+      </w:r>
+      <w:proofErr w:type="spellEnd"/>
+      <w:r>
+        <w:t xml:space="preserve"> (legfrissebb verzió ajánlott).</w:t>
+      </w:r>
+    </w:p>
+    <w:p>
+      <w:pPr>
+        <w:pStyle w:val="Listaszerbekezds"/>
+        <w:numPr>
+          <w:ilvl w:val="0"/>
+          <w:numId w:val="18"/>
+        </w:numPr>
+      </w:pPr>
+      <w:r>
+        <w:rPr>
+          <w:rStyle w:val="Kiemels2"/>
+        </w:rPr>
+        <w:t>Operációs rendszer</w:t>
+      </w:r>
+      <w:r>
+        <w:t xml:space="preserve">: Windows 10/11, </w:t>
+      </w:r>
+      <w:proofErr w:type="spellStart"/>
+      <w:r>
+        <w:t>macOS</w:t>
+      </w:r>
+      <w:proofErr w:type="spellEnd"/>
+      <w:r>
+        <w:t>, Linux disztribúciók, Android vagy iOS.</w:t>
+      </w:r>
+    </w:p>
+    <w:p>
+      <w:pPr>
+        <w:pStyle w:val="Listaszerbekezds"/>
+        <w:numPr>
+          <w:ilvl w:val="0"/>
+          <w:numId w:val="18"/>
+        </w:numPr>
+      </w:pPr>
+      <w:r>
+        <w:rPr>
+          <w:rStyle w:val="Kiemels2"/>
+        </w:rPr>
+        <w:t>Internetkapcsolat</w:t>
+      </w:r>
+      <w:r>
+        <w:t>: stabil online kapcsolat szükséges az adatbázis eléréséhez.</w:t>
+      </w:r>
+    </w:p>
+    <w:p>
+      <w:pPr>
+        <w:pStyle w:val="Listaszerbekezds"/>
+        <w:numPr>
+          <w:ilvl w:val="0"/>
+          <w:numId w:val="18"/>
+        </w:numPr>
+      </w:pPr>
+      <w:r>
+        <w:rPr>
+          <w:rStyle w:val="Kiemels2"/>
+        </w:rPr>
+        <w:t>E-mail fiók</w:t>
+      </w:r>
+      <w:r>
+        <w:t xml:space="preserve">: a regisztráció megerősítéséhez aktív e-mail fiók szükséges (pl. </w:t>
+      </w:r>
+      <w:proofErr w:type="spellStart"/>
+      <w:r>
+        <w:t>Gmail</w:t>
+      </w:r>
+      <w:proofErr w:type="spellEnd"/>
+      <w:r>
+        <w:t>, Freemail, Outlook stb.).</w:t>
+      </w:r>
+    </w:p>
+    <w:p>
+      <w:pPr>
+        <w:spacing w:before="0" w:after="160" w:line="259" w:lineRule="auto"/>
+        <w:jc w:val="left"/>
+        <w:rPr>
+          <w:rFonts w:eastAsiaTheme="majorEastAsia" w:cstheme="majorBidi"/>
+          <w:b/>
+          <w:sz w:val="28"/>
+          <w:szCs w:val="26"/>
+        </w:rPr>
+      </w:pPr>
+      <w:bookmarkStart w:id="11" w:name="_Toc184887509"/>
+      <w:r>
+        <w:br w:type="page"/>
       </w:r>
     </w:p>
     <w:p>
@@ -13429,82 +13658,450 @@
           <w:numId w:val="9"/>
         </w:numPr>
       </w:pPr>
-      <w:bookmarkStart w:id="11" w:name="_Toc184887508"/>
-      <w:r>
-        <w:t>Rendszerkövetelmények</w:t>
+      <w:r>
+        <w:lastRenderedPageBreak/>
+        <w:t>A program telepítése</w:t>
       </w:r>
       <w:bookmarkEnd w:id="11"/>
     </w:p>
     <w:p>
-      <w:pPr>
-        <w:rPr>
+      <w:r>
+        <w:t xml:space="preserve">A </w:t>
+      </w:r>
+      <w:proofErr w:type="spellStart"/>
+      <w:r>
+        <w:t>Nutri</w:t>
+      </w:r>
+      <w:proofErr w:type="spellEnd"/>
+      <w:r>
+        <w:t xml:space="preserve"> alkalmazás </w:t>
+      </w:r>
+      <w:r>
+        <w:rPr>
+          <w:rStyle w:val="Kiemels2"/>
+        </w:rPr>
+        <w:t>nem igényel telepítést</w:t>
+      </w:r>
+      <w:r>
+        <w:t>, mivel egy webes szolgáltatásról van szó. Az alábbi lépések elvégzésével a felhasználó azonnal elkezdheti használni a programot:</w:t>
+      </w:r>
+    </w:p>
+    <w:p>
+      <w:pPr>
+        <w:spacing w:before="100" w:beforeAutospacing="1" w:after="100" w:afterAutospacing="1" w:line="240" w:lineRule="auto"/>
+        <w:jc w:val="left"/>
+        <w:rPr>
+          <w:rFonts w:eastAsia="Times New Roman" w:cs="Times New Roman"/>
+          <w:szCs w:val="24"/>
+          <w:lang w:eastAsia="hu-HU"/>
+        </w:rPr>
+      </w:pPr>
+      <w:proofErr w:type="gramStart"/>
+      <w:r>
+        <w:rPr>
+          <w:rFonts w:eastAsia="Times New Roman" w:hAnsi="Symbol" w:cs="Times New Roman"/>
+          <w:szCs w:val="24"/>
+          <w:lang w:eastAsia="hu-HU"/>
+        </w:rPr>
+        <w:t></w:t>
+      </w:r>
+      <w:r>
+        <w:rPr>
+          <w:rFonts w:eastAsia="Times New Roman" w:cs="Times New Roman"/>
+          <w:szCs w:val="24"/>
+          <w:lang w:eastAsia="hu-HU"/>
+        </w:rPr>
+        <w:t xml:space="preserve">  </w:t>
+      </w:r>
+      <w:r>
+        <w:rPr>
+          <w:rFonts w:eastAsia="Times New Roman" w:cs="Times New Roman"/>
           <w:b/>
-        </w:rPr>
-      </w:pPr>
-      <w:r>
-        <w:rPr>
+          <w:bCs/>
+          <w:szCs w:val="24"/>
+          <w:lang w:eastAsia="hu-HU"/>
+        </w:rPr>
+        <w:t>Nyisd</w:t>
+      </w:r>
+      <w:proofErr w:type="gramEnd"/>
+      <w:r>
+        <w:rPr>
+          <w:rFonts w:eastAsia="Times New Roman" w:cs="Times New Roman"/>
           <w:b/>
-        </w:rPr>
-        <w:t>Hardver követelmények</w:t>
-      </w:r>
-    </w:p>
-    <w:p>
-      <w:r>
-        <w:t>A program futtatásához egy modern webböngészőre van szükség.</w:t>
-      </w:r>
-      <w:r>
-        <w:t xml:space="preserve"> </w:t>
-      </w:r>
-      <w:r>
-        <w:t xml:space="preserve">Ez lehet Chrome, Firefox, </w:t>
-      </w:r>
-      <w:proofErr w:type="spellStart"/>
-      <w:r>
-        <w:t>Safari</w:t>
-      </w:r>
-      <w:proofErr w:type="spellEnd"/>
-      <w:r>
-        <w:t>, vagy bármi más.</w:t>
-      </w:r>
-      <w:r>
-        <w:t xml:space="preserve"> </w:t>
-      </w:r>
-    </w:p>
-    <w:p>
-      <w:pPr>
-        <w:rPr>
+          <w:bCs/>
+          <w:szCs w:val="24"/>
+          <w:lang w:eastAsia="hu-HU"/>
+        </w:rPr>
+        <w:t xml:space="preserve"> meg a webböngészőt.</w:t>
+      </w:r>
+    </w:p>
+    <w:p>
+      <w:pPr>
+        <w:spacing w:before="100" w:beforeAutospacing="1" w:after="100" w:afterAutospacing="1" w:line="240" w:lineRule="auto"/>
+        <w:jc w:val="left"/>
+        <w:rPr>
+          <w:rFonts w:eastAsia="Times New Roman" w:cs="Times New Roman"/>
+          <w:szCs w:val="24"/>
+          <w:lang w:eastAsia="hu-HU"/>
+        </w:rPr>
+      </w:pPr>
+      <w:proofErr w:type="gramStart"/>
+      <w:r>
+        <w:rPr>
+          <w:rFonts w:eastAsia="Times New Roman" w:hAnsi="Symbol" w:cs="Times New Roman"/>
+          <w:szCs w:val="24"/>
+          <w:lang w:eastAsia="hu-HU"/>
+        </w:rPr>
+        <w:t></w:t>
+      </w:r>
+      <w:r>
+        <w:rPr>
+          <w:rFonts w:eastAsia="Times New Roman" w:cs="Times New Roman"/>
+          <w:szCs w:val="24"/>
+          <w:lang w:eastAsia="hu-HU"/>
+        </w:rPr>
+        <w:t xml:space="preserve">  Írd</w:t>
+      </w:r>
+      <w:proofErr w:type="gramEnd"/>
+      <w:r>
+        <w:rPr>
+          <w:rFonts w:eastAsia="Times New Roman" w:cs="Times New Roman"/>
+          <w:szCs w:val="24"/>
+          <w:lang w:eastAsia="hu-HU"/>
+        </w:rPr>
+        <w:t xml:space="preserve"> be a </w:t>
+      </w:r>
+      <w:proofErr w:type="spellStart"/>
+      <w:r>
+        <w:rPr>
+          <w:rFonts w:eastAsia="Times New Roman" w:cs="Times New Roman"/>
+          <w:szCs w:val="24"/>
+          <w:lang w:eastAsia="hu-HU"/>
+        </w:rPr>
+        <w:t>Nutri</w:t>
+      </w:r>
+      <w:proofErr w:type="spellEnd"/>
+      <w:r>
+        <w:rPr>
+          <w:rFonts w:eastAsia="Times New Roman" w:cs="Times New Roman"/>
+          <w:szCs w:val="24"/>
+          <w:lang w:eastAsia="hu-HU"/>
+        </w:rPr>
+        <w:t xml:space="preserve"> alkalmazás elérhetőségét a címsorba (</w:t>
+      </w:r>
+      <w:r>
+        <w:rPr>
+          <w:rFonts w:eastAsia="Times New Roman" w:cs="Times New Roman"/>
+          <w:szCs w:val="24"/>
+          <w:lang w:eastAsia="hu-HU"/>
+        </w:rPr>
+        <w:t xml:space="preserve">mivel nincs </w:t>
+      </w:r>
+      <w:proofErr w:type="spellStart"/>
+      <w:r>
+        <w:rPr>
+          <w:rFonts w:eastAsia="Times New Roman" w:cs="Times New Roman"/>
+          <w:szCs w:val="24"/>
+          <w:lang w:eastAsia="hu-HU"/>
+        </w:rPr>
+        <w:t>hostolva</w:t>
+      </w:r>
+      <w:proofErr w:type="spellEnd"/>
+      <w:r>
+        <w:rPr>
+          <w:rFonts w:eastAsia="Times New Roman" w:cs="Times New Roman"/>
+          <w:szCs w:val="24"/>
+          <w:lang w:eastAsia="hu-HU"/>
+        </w:rPr>
+        <w:t xml:space="preserve"> - </w:t>
+      </w:r>
+      <w:r>
+        <w:rPr>
+          <w:rFonts w:ascii="Courier New" w:eastAsia="Times New Roman" w:hAnsi="Courier New" w:cs="Courier New"/>
+          <w:sz w:val="20"/>
+          <w:szCs w:val="20"/>
+          <w:lang w:eastAsia="hu-HU"/>
+        </w:rPr>
+        <w:t>https://</w:t>
+      </w:r>
+      <w:r>
+        <w:rPr>
+          <w:rFonts w:ascii="Courier New" w:eastAsia="Times New Roman" w:hAnsi="Courier New" w:cs="Courier New"/>
+          <w:sz w:val="20"/>
+          <w:szCs w:val="20"/>
+          <w:lang w:eastAsia="hu-HU"/>
+        </w:rPr>
+        <w:t>localhost:8000/</w:t>
+      </w:r>
+      <w:r>
+        <w:rPr>
+          <w:rFonts w:eastAsia="Times New Roman" w:cs="Times New Roman"/>
+          <w:szCs w:val="24"/>
+          <w:lang w:eastAsia="hu-HU"/>
+        </w:rPr>
+        <w:t>)</w:t>
+      </w:r>
+    </w:p>
+    <w:p>
+      <w:pPr>
+        <w:spacing w:before="100" w:beforeAutospacing="1" w:after="100" w:afterAutospacing="1" w:line="240" w:lineRule="auto"/>
+        <w:jc w:val="left"/>
+        <w:rPr>
+          <w:rFonts w:eastAsia="Times New Roman" w:cs="Times New Roman"/>
+          <w:szCs w:val="24"/>
+          <w:lang w:eastAsia="hu-HU"/>
+        </w:rPr>
+      </w:pPr>
+      <w:proofErr w:type="gramStart"/>
+      <w:r>
+        <w:rPr>
+          <w:rFonts w:eastAsia="Times New Roman" w:hAnsi="Symbol" w:cs="Times New Roman"/>
+          <w:szCs w:val="24"/>
+          <w:lang w:eastAsia="hu-HU"/>
+        </w:rPr>
+        <w:t></w:t>
+      </w:r>
+      <w:r>
+        <w:rPr>
+          <w:rFonts w:eastAsia="Times New Roman" w:cs="Times New Roman"/>
+          <w:szCs w:val="24"/>
+          <w:lang w:eastAsia="hu-HU"/>
+        </w:rPr>
+        <w:t xml:space="preserve">  A</w:t>
+      </w:r>
+      <w:proofErr w:type="gramEnd"/>
+      <w:r>
+        <w:rPr>
+          <w:rFonts w:eastAsia="Times New Roman" w:cs="Times New Roman"/>
+          <w:szCs w:val="24"/>
+          <w:lang w:eastAsia="hu-HU"/>
+        </w:rPr>
+        <w:t xml:space="preserve"> főoldalon kattints a </w:t>
+      </w:r>
+      <w:r>
+        <w:rPr>
+          <w:rFonts w:eastAsia="Times New Roman" w:cs="Times New Roman"/>
           <w:b/>
-        </w:rPr>
-      </w:pPr>
-      <w:r>
-        <w:rPr>
+          <w:bCs/>
+          <w:szCs w:val="24"/>
+          <w:lang w:eastAsia="hu-HU"/>
+        </w:rPr>
+        <w:t>„</w:t>
+      </w:r>
+      <w:proofErr w:type="spellStart"/>
+      <w:r>
+        <w:rPr>
+          <w:rFonts w:eastAsia="Times New Roman" w:cs="Times New Roman"/>
           <w:b/>
-        </w:rPr>
-        <w:t>Szoftver követelmények</w:t>
-      </w:r>
-    </w:p>
-    <w:p>
-      <w:r>
-        <w:t xml:space="preserve">A program működéséhez egy Operációs Rendszer szükséges, ami képes modern Webböngészők futtatására. Emellett szükséges </w:t>
-      </w:r>
-      <w:r>
-        <w:t xml:space="preserve">egy e-mail fiók, </w:t>
-      </w:r>
-      <w:proofErr w:type="spellStart"/>
-      <w:r>
-        <w:t>pl</w:t>
-      </w:r>
-      <w:proofErr w:type="spellEnd"/>
-      <w:r>
-        <w:t xml:space="preserve"> </w:t>
-      </w:r>
-      <w:r>
-        <w:t>Gmail</w:t>
-      </w:r>
-      <w:r>
-        <w:t>, Freemail, vagy bármi más.</w:t>
-      </w:r>
-    </w:p>
+          <w:bCs/>
+          <w:szCs w:val="24"/>
+          <w:lang w:eastAsia="hu-HU"/>
+        </w:rPr>
+        <w:t>Register</w:t>
+      </w:r>
+      <w:proofErr w:type="spellEnd"/>
+      <w:r>
+        <w:rPr>
+          <w:rFonts w:eastAsia="Times New Roman" w:cs="Times New Roman"/>
+          <w:b/>
+          <w:bCs/>
+          <w:szCs w:val="24"/>
+          <w:lang w:eastAsia="hu-HU"/>
+        </w:rPr>
+        <w:t>”</w:t>
+      </w:r>
+      <w:r>
+        <w:rPr>
+          <w:rFonts w:eastAsia="Times New Roman" w:cs="Times New Roman"/>
+          <w:szCs w:val="24"/>
+          <w:lang w:eastAsia="hu-HU"/>
+        </w:rPr>
+        <w:t xml:space="preserve"> gombra.</w:t>
+      </w:r>
+      <w:r>
+        <w:rPr>
+          <w:rFonts w:eastAsia="Times New Roman" w:cs="Times New Roman"/>
+          <w:szCs w:val="24"/>
+          <w:lang w:eastAsia="hu-HU"/>
+        </w:rPr>
+        <w:t>(Jobb felső sarok)</w:t>
+      </w:r>
+    </w:p>
+    <w:p>
+      <w:pPr>
+        <w:spacing w:before="100" w:beforeAutospacing="1" w:after="100" w:afterAutospacing="1" w:line="240" w:lineRule="auto"/>
+        <w:jc w:val="left"/>
+        <w:rPr>
+          <w:rFonts w:eastAsia="Times New Roman" w:cs="Times New Roman"/>
+          <w:szCs w:val="24"/>
+          <w:lang w:eastAsia="hu-HU"/>
+        </w:rPr>
+      </w:pPr>
+      <w:proofErr w:type="gramStart"/>
+      <w:r>
+        <w:rPr>
+          <w:rFonts w:eastAsia="Times New Roman" w:hAnsi="Symbol" w:cs="Times New Roman"/>
+          <w:szCs w:val="24"/>
+          <w:lang w:eastAsia="hu-HU"/>
+        </w:rPr>
+        <w:t></w:t>
+      </w:r>
+      <w:r>
+        <w:rPr>
+          <w:rFonts w:eastAsia="Times New Roman" w:cs="Times New Roman"/>
+          <w:szCs w:val="24"/>
+          <w:lang w:eastAsia="hu-HU"/>
+        </w:rPr>
+        <w:t xml:space="preserve">  Töltsd</w:t>
+      </w:r>
+      <w:proofErr w:type="gramEnd"/>
+      <w:r>
+        <w:rPr>
+          <w:rFonts w:eastAsia="Times New Roman" w:cs="Times New Roman"/>
+          <w:szCs w:val="24"/>
+          <w:lang w:eastAsia="hu-HU"/>
+        </w:rPr>
+        <w:t xml:space="preserve"> ki a regisztrációs űrlapot: e-mail cím, jelszó, felhasználónév.</w:t>
+      </w:r>
+    </w:p>
+    <w:p>
+      <w:pPr>
+        <w:spacing w:before="100" w:beforeAutospacing="1" w:after="100" w:afterAutospacing="1" w:line="240" w:lineRule="auto"/>
+        <w:jc w:val="left"/>
+        <w:rPr>
+          <w:rFonts w:eastAsia="Times New Roman" w:cs="Times New Roman"/>
+          <w:szCs w:val="24"/>
+          <w:lang w:eastAsia="hu-HU"/>
+        </w:rPr>
+      </w:pPr>
+      <w:proofErr w:type="gramStart"/>
+      <w:r>
+        <w:rPr>
+          <w:rFonts w:eastAsia="Times New Roman" w:hAnsi="Symbol" w:cs="Times New Roman"/>
+          <w:szCs w:val="24"/>
+          <w:lang w:eastAsia="hu-HU"/>
+        </w:rPr>
+        <w:t></w:t>
+      </w:r>
+      <w:r>
+        <w:rPr>
+          <w:rFonts w:eastAsia="Times New Roman" w:cs="Times New Roman"/>
+          <w:szCs w:val="24"/>
+          <w:lang w:eastAsia="hu-HU"/>
+        </w:rPr>
+        <w:t xml:space="preserve">  Kattints</w:t>
+      </w:r>
+      <w:proofErr w:type="gramEnd"/>
+      <w:r>
+        <w:rPr>
+          <w:rFonts w:eastAsia="Times New Roman" w:cs="Times New Roman"/>
+          <w:szCs w:val="24"/>
+          <w:lang w:eastAsia="hu-HU"/>
+        </w:rPr>
+        <w:t xml:space="preserve"> a „</w:t>
+      </w:r>
+      <w:proofErr w:type="spellStart"/>
+      <w:r>
+        <w:rPr>
+          <w:rFonts w:eastAsia="Times New Roman" w:cs="Times New Roman"/>
+          <w:szCs w:val="24"/>
+          <w:lang w:eastAsia="hu-HU"/>
+        </w:rPr>
+        <w:t>Register</w:t>
+      </w:r>
+      <w:proofErr w:type="spellEnd"/>
+      <w:r>
+        <w:rPr>
+          <w:rFonts w:eastAsia="Times New Roman" w:cs="Times New Roman"/>
+          <w:szCs w:val="24"/>
+          <w:lang w:eastAsia="hu-HU"/>
+        </w:rPr>
+        <w:t>” gombra.</w:t>
+      </w:r>
+      <w:r>
+        <w:rPr>
+          <w:rFonts w:eastAsia="Times New Roman" w:cs="Times New Roman"/>
+          <w:szCs w:val="24"/>
+          <w:lang w:eastAsia="hu-HU"/>
+        </w:rPr>
+        <w:t xml:space="preserve"> (középen)</w:t>
+      </w:r>
+    </w:p>
+    <w:p>
+      <w:pPr>
+        <w:spacing w:before="100" w:beforeAutospacing="1" w:after="100" w:afterAutospacing="1" w:line="240" w:lineRule="auto"/>
+        <w:jc w:val="left"/>
+        <w:rPr>
+          <w:rFonts w:eastAsia="Times New Roman" w:cs="Times New Roman"/>
+          <w:szCs w:val="24"/>
+          <w:lang w:eastAsia="hu-HU"/>
+        </w:rPr>
+      </w:pPr>
+      <w:proofErr w:type="gramStart"/>
+      <w:r>
+        <w:rPr>
+          <w:rFonts w:eastAsia="Times New Roman" w:hAnsi="Symbol" w:cs="Times New Roman"/>
+          <w:szCs w:val="24"/>
+          <w:lang w:eastAsia="hu-HU"/>
+        </w:rPr>
+        <w:t></w:t>
+      </w:r>
+      <w:r>
+        <w:rPr>
+          <w:rFonts w:eastAsia="Times New Roman" w:cs="Times New Roman"/>
+          <w:szCs w:val="24"/>
+          <w:lang w:eastAsia="hu-HU"/>
+        </w:rPr>
+        <w:t xml:space="preserve">  Ellenőrizd</w:t>
+      </w:r>
+      <w:proofErr w:type="gramEnd"/>
+      <w:r>
+        <w:rPr>
+          <w:rFonts w:eastAsia="Times New Roman" w:cs="Times New Roman"/>
+          <w:szCs w:val="24"/>
+          <w:lang w:eastAsia="hu-HU"/>
+        </w:rPr>
+        <w:t xml:space="preserve"> az e-mail fiókodat: egy megerősítő e-mailt kapsz, amelyben található egy aktiváló link.</w:t>
+      </w:r>
+    </w:p>
+    <w:p>
+      <w:pPr>
+        <w:spacing w:before="100" w:beforeAutospacing="1" w:after="100" w:afterAutospacing="1" w:line="240" w:lineRule="auto"/>
+        <w:jc w:val="left"/>
+        <w:rPr>
+          <w:rFonts w:eastAsia="Times New Roman" w:cs="Times New Roman"/>
+          <w:szCs w:val="24"/>
+          <w:lang w:eastAsia="hu-HU"/>
+        </w:rPr>
+      </w:pPr>
+      <w:proofErr w:type="gramStart"/>
+      <w:r>
+        <w:rPr>
+          <w:rFonts w:eastAsia="Times New Roman" w:hAnsi="Symbol" w:cs="Times New Roman"/>
+          <w:szCs w:val="24"/>
+          <w:lang w:eastAsia="hu-HU"/>
+        </w:rPr>
+        <w:t></w:t>
+      </w:r>
+      <w:r>
+        <w:rPr>
+          <w:rFonts w:eastAsia="Times New Roman" w:cs="Times New Roman"/>
+          <w:szCs w:val="24"/>
+          <w:lang w:eastAsia="hu-HU"/>
+        </w:rPr>
+        <w:t xml:space="preserve">  Kattints</w:t>
+      </w:r>
+      <w:proofErr w:type="gramEnd"/>
+      <w:r>
+        <w:rPr>
+          <w:rFonts w:eastAsia="Times New Roman" w:cs="Times New Roman"/>
+          <w:szCs w:val="24"/>
+          <w:lang w:eastAsia="hu-HU"/>
+        </w:rPr>
+        <w:t xml:space="preserve"> a linkre az aktiváláshoz – innentől kezdve be tudsz jelentkezni.</w:t>
+      </w:r>
+    </w:p>
+    <w:p/>
     <w:p>
       <w:pPr>
         <w:pStyle w:val="Cmsor2"/>
@@ -13513,206 +14110,451 @@
           <w:numId w:val="9"/>
         </w:numPr>
       </w:pPr>
-      <w:bookmarkStart w:id="12" w:name="_Toc184887509"/>
-      <w:r>
-        <w:t>A program telepítése</w:t>
+      <w:bookmarkStart w:id="12" w:name="_Toc184887510"/>
+      <w:r>
+        <w:t>A program használatának a részletes leírása</w:t>
       </w:r>
       <w:bookmarkEnd w:id="12"/>
     </w:p>
     <w:p>
       <w:r>
-        <w:t>•</w:t>
-      </w:r>
-      <w:r>
-        <w:tab/>
-        <w:t>Képekkel illusztrált, részletes leírás a program telepítésének a menetéről.</w:t>
-      </w:r>
-    </w:p>
-    <w:p>
-      <w:r>
-        <w:t>•</w:t>
-      </w:r>
-      <w:r>
-        <w:tab/>
-        <w:t>A leírás alapján a felhasználónak hiba nélkül telepíteni kell tudni a programot. A leírásnak ki kell térnie a telepítés során kiválasztható opciókra is.</w:t>
-      </w:r>
-    </w:p>
-    <w:p>
-      <w:r>
-        <w:t>•</w:t>
-      </w:r>
-      <w:r>
-        <w:tab/>
-        <w:t>Ha esetleg nincs telepítőprogram, akkor kellő részletességgel le kell írni, hogy mely fájlokat, pontosan hova kell felmásolni, és hogy lehet a programot futtatni.</w:t>
-      </w:r>
-    </w:p>
-    <w:p>
-      <w:r>
-        <w:t xml:space="preserve">Ajánlott terjedelem: </w:t>
-      </w:r>
-      <w:r>
-        <w:t>1-</w:t>
-      </w:r>
-      <w:r>
-        <w:t>3</w:t>
-      </w:r>
-      <w:r>
-        <w:t xml:space="preserve"> oldal, ábrákkal együtt.</w:t>
-      </w:r>
-    </w:p>
-    <w:p>
-      <w:pPr>
-        <w:pStyle w:val="Cmsor2"/>
+        <w:t xml:space="preserve">Ajánlott: </w:t>
+      </w:r>
+    </w:p>
+    <w:p>
+      <w:pPr>
+        <w:pStyle w:val="Listaszerbekezds"/>
         <w:numPr>
           <w:ilvl w:val="0"/>
-          <w:numId w:val="9"/>
-        </w:numPr>
-      </w:pPr>
-      <w:bookmarkStart w:id="13" w:name="_Toc184887510"/>
-      <w:r>
-        <w:t>A program használatának a részletes leírása</w:t>
+          <w:numId w:val="20"/>
+        </w:numPr>
+      </w:pPr>
+      <w:r>
+        <w:t>Regisztrálj</w:t>
+      </w:r>
+    </w:p>
+    <w:p>
+      <w:pPr>
+        <w:pStyle w:val="Listaszerbekezds"/>
+        <w:numPr>
+          <w:ilvl w:val="0"/>
+          <w:numId w:val="20"/>
+        </w:numPr>
+      </w:pPr>
+      <w:r>
+        <w:t>Jelentkezz be</w:t>
+      </w:r>
+    </w:p>
+    <w:p>
+      <w:r>
+        <w:t>Ha nem regisztrálsz, nem tudsz ételeket / változtatásokat létrehozni.</w:t>
+      </w:r>
+    </w:p>
+    <w:p>
+      <w:r>
+        <w:t>Ha találsz olyan éttermet</w:t>
+      </w:r>
+      <w:r>
+        <w:t>,</w:t>
+      </w:r>
+      <w:r>
+        <w:t xml:space="preserve"> ami nincs fent a listán, írj a </w:t>
+      </w:r>
+      <w:proofErr w:type="spellStart"/>
+      <w:r>
+        <w:t>supportnak</w:t>
+      </w:r>
+      <w:proofErr w:type="spellEnd"/>
+      <w:r>
+        <w:t>.</w:t>
+      </w:r>
+    </w:p>
+    <w:p>
+      <w:r>
+        <w:t xml:space="preserve"> </w:t>
+      </w:r>
+    </w:p>
+    <w:p>
+      <w:r>
+        <w:t>Ajánlott terjedelem: 1-</w:t>
+      </w:r>
+      <w:r>
+        <w:t>5</w:t>
+      </w:r>
+      <w:r>
+        <w:t xml:space="preserve"> oldal</w:t>
+      </w:r>
+    </w:p>
+    <w:p>
+      <w:pPr>
+        <w:spacing w:before="0" w:after="160" w:line="259" w:lineRule="auto"/>
+        <w:jc w:val="left"/>
+        <w:rPr>
+          <w:rFonts w:eastAsiaTheme="majorEastAsia" w:cstheme="majorBidi"/>
+          <w:b/>
+          <w:sz w:val="32"/>
+          <w:szCs w:val="32"/>
+          <w:highlight w:val="lightGray"/>
+        </w:rPr>
+      </w:pPr>
+      <w:bookmarkStart w:id="13" w:name="_Toc184887511"/>
+      <w:r>
+        <w:rPr>
+          <w:highlight w:val="lightGray"/>
+        </w:rPr>
+        <w:br w:type="page"/>
+      </w:r>
+    </w:p>
+    <w:p>
+      <w:pPr>
+        <w:pStyle w:val="Cmsor1"/>
+        <w:numPr>
+          <w:ilvl w:val="0"/>
+          <w:numId w:val="0"/>
+        </w:numPr>
+        <w:ind w:left="360"/>
+      </w:pPr>
+      <w:r>
+        <w:lastRenderedPageBreak/>
+        <w:t>Összegzés</w:t>
       </w:r>
       <w:bookmarkEnd w:id="13"/>
     </w:p>
     <w:p>
-      <w:r>
-        <w:t>Mindenre kiterjedő, részletes leírás a program használatáról.</w:t>
-      </w:r>
-    </w:p>
-    <w:p>
-      <w:r>
-        <w:t>Alapszabályok:</w:t>
-      </w:r>
-    </w:p>
-    <w:p>
-      <w:r>
-        <w:t>•</w:t>
-      </w:r>
-      <w:r>
-        <w:tab/>
-        <w:t>Amit leprogramoztál, azt a dokumentációban írd is le, ne legyenek eltitkolt funkciók.</w:t>
-      </w:r>
-    </w:p>
-    <w:p>
-      <w:r>
-        <w:t>•</w:t>
-      </w:r>
-      <w:r>
-        <w:tab/>
-        <w:t>Minden pontosan, „szájbarágósan” legyen leírva. A dokumentáció alapján a teljesen kezdő, vagy laikus felhasználóknak is használniuk kell tudni a programot.</w:t>
-      </w:r>
-    </w:p>
-    <w:p>
-      <w:r>
-        <w:t>•</w:t>
-      </w:r>
-      <w:r>
-        <w:tab/>
-        <w:t>A stílus legyen pontos és közérthető, vedd figyelembe, hogy a felhasználói dokumentáció nem szakembereknek készül.</w:t>
-      </w:r>
-    </w:p>
-    <w:p>
+      <w:pPr>
+        <w:spacing w:before="100" w:beforeAutospacing="1" w:after="100" w:afterAutospacing="1" w:line="240" w:lineRule="auto"/>
+        <w:rPr>
+          <w:rFonts w:eastAsia="Times New Roman" w:cs="Times New Roman"/>
+          <w:szCs w:val="24"/>
+          <w:lang w:eastAsia="hu-HU"/>
+        </w:rPr>
+      </w:pPr>
+      <w:r>
+        <w:rPr>
+          <w:rFonts w:eastAsia="Times New Roman" w:cs="Times New Roman"/>
+          <w:szCs w:val="24"/>
+          <w:lang w:eastAsia="hu-HU"/>
+        </w:rPr>
+        <w:t xml:space="preserve">A </w:t>
+      </w:r>
+      <w:proofErr w:type="spellStart"/>
+      <w:r>
+        <w:rPr>
+          <w:rFonts w:eastAsia="Times New Roman" w:cs="Times New Roman"/>
+          <w:szCs w:val="24"/>
+          <w:lang w:eastAsia="hu-HU"/>
+        </w:rPr>
+        <w:t>Nutri</w:t>
+      </w:r>
+      <w:proofErr w:type="spellEnd"/>
+      <w:r>
+        <w:rPr>
+          <w:rFonts w:eastAsia="Times New Roman" w:cs="Times New Roman"/>
+          <w:szCs w:val="24"/>
+          <w:lang w:eastAsia="hu-HU"/>
+        </w:rPr>
+        <w:t xml:space="preserve"> projekt MVP (Minimum </w:t>
+      </w:r>
+      <w:proofErr w:type="spellStart"/>
+      <w:r>
+        <w:rPr>
+          <w:rFonts w:eastAsia="Times New Roman" w:cs="Times New Roman"/>
+          <w:szCs w:val="24"/>
+          <w:lang w:eastAsia="hu-HU"/>
+        </w:rPr>
+        <w:t>Viable</w:t>
+      </w:r>
+      <w:proofErr w:type="spellEnd"/>
+      <w:r>
+        <w:rPr>
+          <w:rFonts w:eastAsia="Times New Roman" w:cs="Times New Roman"/>
+          <w:szCs w:val="24"/>
+          <w:lang w:eastAsia="hu-HU"/>
+        </w:rPr>
+        <w:t xml:space="preserve"> </w:t>
+      </w:r>
+      <w:proofErr w:type="spellStart"/>
+      <w:r>
+        <w:rPr>
+          <w:rFonts w:eastAsia="Times New Roman" w:cs="Times New Roman"/>
+          <w:szCs w:val="24"/>
+          <w:lang w:eastAsia="hu-HU"/>
+        </w:rPr>
+        <w:t>Product</w:t>
+      </w:r>
+      <w:proofErr w:type="spellEnd"/>
+      <w:r>
+        <w:rPr>
+          <w:rFonts w:eastAsia="Times New Roman" w:cs="Times New Roman"/>
+          <w:szCs w:val="24"/>
+          <w:lang w:eastAsia="hu-HU"/>
+        </w:rPr>
+        <w:t>) állapotban van: a legalapvetőbb funkciók működnek, a rendszer használatra kész. A további fejlesztések során a többnyelvűség és a nemzetközi ételadatbázisok támogatása kerülhet fókuszba. A jövőbeni bővítési lehetőségek közé tartozik a mobilalkalmazás fejlesztése, gépi tanulási alapú veszélyességi előrejelzések bevezetése, valamint a felhasználói szokások alapján történő ételajánlás.</w:t>
+      </w:r>
+      <w:r>
+        <w:rPr>
+          <w:rFonts w:eastAsia="Times New Roman" w:cs="Times New Roman"/>
+          <w:szCs w:val="24"/>
+          <w:lang w:eastAsia="hu-HU"/>
+        </w:rPr>
+        <w:t xml:space="preserve"> Továbbfejlesztési lehetőségek:</w:t>
+      </w:r>
+    </w:p>
+    <w:p>
+      <w:pPr>
+        <w:pStyle w:val="Listaszerbekezds"/>
+        <w:numPr>
+          <w:ilvl w:val="0"/>
+          <w:numId w:val="21"/>
+        </w:numPr>
+        <w:spacing w:before="100" w:beforeAutospacing="1" w:after="100" w:afterAutospacing="1" w:line="240" w:lineRule="auto"/>
+        <w:rPr>
+          <w:rFonts w:eastAsia="Times New Roman" w:cs="Times New Roman"/>
+          <w:szCs w:val="24"/>
+          <w:lang w:eastAsia="hu-HU"/>
+        </w:rPr>
+      </w:pPr>
+      <w:r>
+        <w:rPr>
+          <w:rFonts w:eastAsia="Times New Roman" w:cs="Times New Roman"/>
+          <w:szCs w:val="24"/>
+          <w:lang w:eastAsia="hu-HU"/>
+        </w:rPr>
+        <w:t>Több ország és nyelv támogatása</w:t>
+      </w:r>
+      <w:r>
+        <w:rPr>
+          <w:rFonts w:eastAsia="Times New Roman" w:cs="Times New Roman"/>
+          <w:szCs w:val="24"/>
+          <w:lang w:eastAsia="hu-HU"/>
+        </w:rPr>
+        <w:t xml:space="preserve"> (Ehhez úgy táblákra van szükség)</w:t>
+      </w:r>
+      <w:r>
+        <w:rPr>
+          <w:rFonts w:eastAsia="Times New Roman" w:cs="Times New Roman"/>
+          <w:szCs w:val="24"/>
+          <w:lang w:eastAsia="hu-HU"/>
+        </w:rPr>
+        <w:t>.</w:t>
+      </w:r>
+    </w:p>
+    <w:p>
+      <w:pPr>
+        <w:pStyle w:val="Listaszerbekezds"/>
+        <w:numPr>
+          <w:ilvl w:val="0"/>
+          <w:numId w:val="21"/>
+        </w:numPr>
+        <w:spacing w:before="100" w:beforeAutospacing="1" w:after="100" w:afterAutospacing="1" w:line="240" w:lineRule="auto"/>
+        <w:rPr>
+          <w:rFonts w:eastAsia="Times New Roman" w:cs="Times New Roman"/>
+          <w:szCs w:val="24"/>
+          <w:lang w:eastAsia="hu-HU"/>
+        </w:rPr>
+      </w:pPr>
+      <w:r>
+        <w:rPr>
+          <w:rFonts w:eastAsia="Times New Roman" w:cs="Times New Roman"/>
+          <w:szCs w:val="24"/>
+          <w:lang w:eastAsia="hu-HU"/>
+        </w:rPr>
+        <w:t>Fájlszerver létrehozása kizárólag a képeknek</w:t>
+      </w:r>
+    </w:p>
+    <w:p>
+      <w:pPr>
+        <w:pStyle w:val="Listaszerbekezds"/>
+        <w:numPr>
+          <w:ilvl w:val="0"/>
+          <w:numId w:val="21"/>
+        </w:numPr>
+        <w:spacing w:before="100" w:beforeAutospacing="1" w:after="100" w:afterAutospacing="1" w:line="240" w:lineRule="auto"/>
+        <w:rPr>
+          <w:rFonts w:eastAsia="Times New Roman" w:cs="Times New Roman"/>
+          <w:szCs w:val="24"/>
+          <w:lang w:eastAsia="hu-HU"/>
+        </w:rPr>
+      </w:pPr>
+      <w:proofErr w:type="spellStart"/>
+      <w:r>
+        <w:rPr>
+          <w:rFonts w:eastAsia="Times New Roman" w:cs="Times New Roman"/>
+          <w:szCs w:val="24"/>
+          <w:lang w:eastAsia="hu-HU"/>
+        </w:rPr>
+        <w:t>Load</w:t>
+      </w:r>
+      <w:proofErr w:type="spellEnd"/>
+      <w:r>
+        <w:rPr>
+          <w:rFonts w:eastAsia="Times New Roman" w:cs="Times New Roman"/>
+          <w:szCs w:val="24"/>
+          <w:lang w:eastAsia="hu-HU"/>
+        </w:rPr>
+        <w:t xml:space="preserve"> </w:t>
+      </w:r>
+      <w:proofErr w:type="spellStart"/>
+      <w:r>
+        <w:rPr>
+          <w:rFonts w:eastAsia="Times New Roman" w:cs="Times New Roman"/>
+          <w:szCs w:val="24"/>
+          <w:lang w:eastAsia="hu-HU"/>
+        </w:rPr>
+        <w:t>Balancerek</w:t>
+      </w:r>
+      <w:proofErr w:type="spellEnd"/>
+      <w:r>
+        <w:rPr>
+          <w:rFonts w:eastAsia="Times New Roman" w:cs="Times New Roman"/>
+          <w:szCs w:val="24"/>
+          <w:lang w:eastAsia="hu-HU"/>
+        </w:rPr>
+        <w:t xml:space="preserve"> alkalmazása</w:t>
+      </w:r>
+      <w:r>
+        <w:rPr>
+          <w:rFonts w:eastAsia="Times New Roman" w:cs="Times New Roman"/>
+          <w:szCs w:val="24"/>
+          <w:lang w:eastAsia="hu-HU"/>
+        </w:rPr>
+        <w:t xml:space="preserve"> a skálázhatóságért</w:t>
+      </w:r>
+    </w:p>
+    <w:p>
+      <w:pPr>
+        <w:pStyle w:val="Listaszerbekezds"/>
+        <w:numPr>
+          <w:ilvl w:val="0"/>
+          <w:numId w:val="21"/>
+        </w:numPr>
+        <w:spacing w:before="100" w:beforeAutospacing="1" w:after="100" w:afterAutospacing="1" w:line="240" w:lineRule="auto"/>
+        <w:rPr>
+          <w:rFonts w:eastAsia="Times New Roman" w:cs="Times New Roman"/>
+          <w:szCs w:val="24"/>
+          <w:lang w:eastAsia="hu-HU"/>
+        </w:rPr>
+      </w:pPr>
+      <w:r>
+        <w:rPr>
+          <w:rFonts w:eastAsia="Times New Roman" w:cs="Times New Roman"/>
+          <w:szCs w:val="24"/>
+          <w:lang w:eastAsia="hu-HU"/>
+        </w:rPr>
+        <w:t xml:space="preserve">Összes vallási </w:t>
+      </w:r>
+      <w:r>
+        <w:rPr>
+          <w:rFonts w:eastAsia="Times New Roman" w:cs="Times New Roman"/>
+          <w:szCs w:val="24"/>
+          <w:lang w:eastAsia="hu-HU"/>
+        </w:rPr>
+        <w:t xml:space="preserve">korlátozás </w:t>
+      </w:r>
+      <w:r>
+        <w:rPr>
+          <w:rFonts w:eastAsia="Times New Roman" w:cs="Times New Roman"/>
+          <w:szCs w:val="24"/>
+          <w:lang w:eastAsia="hu-HU"/>
+        </w:rPr>
+        <w:t>támogatása</w:t>
+      </w:r>
+    </w:p>
+    <w:p>
+      <w:pPr>
+        <w:pStyle w:val="Listaszerbekezds"/>
+        <w:numPr>
+          <w:ilvl w:val="0"/>
+          <w:numId w:val="21"/>
+        </w:numPr>
+        <w:spacing w:before="100" w:beforeAutospacing="1" w:after="100" w:afterAutospacing="1" w:line="240" w:lineRule="auto"/>
+        <w:rPr>
+          <w:rFonts w:eastAsia="Times New Roman" w:cs="Times New Roman"/>
+          <w:szCs w:val="24"/>
+          <w:lang w:eastAsia="hu-HU"/>
+        </w:rPr>
+      </w:pPr>
+      <w:r>
+        <w:rPr>
+          <w:rFonts w:eastAsia="Times New Roman" w:cs="Times New Roman"/>
+          <w:szCs w:val="24"/>
+          <w:lang w:eastAsia="hu-HU"/>
+        </w:rPr>
+        <w:t xml:space="preserve">Életkor és egészségügyi állapot alapján </w:t>
+      </w:r>
+      <w:r>
+        <w:rPr>
+          <w:rFonts w:eastAsia="Times New Roman" w:cs="Times New Roman"/>
+          <w:szCs w:val="24"/>
+          <w:lang w:eastAsia="hu-HU"/>
+        </w:rPr>
+        <w:t>is lehetne ajánlásokat bevezetni</w:t>
+      </w:r>
+    </w:p>
+    <w:p>
+      <w:pPr>
+        <w:spacing w:before="100" w:beforeAutospacing="1" w:after="100" w:afterAutospacing="1" w:line="240" w:lineRule="auto"/>
+        <w:rPr>
+          <w:rFonts w:eastAsia="Times New Roman" w:cs="Times New Roman"/>
+          <w:szCs w:val="24"/>
+          <w:lang w:eastAsia="hu-HU"/>
+        </w:rPr>
+      </w:pPr>
+      <w:r>
+        <w:rPr>
+          <w:rFonts w:eastAsia="Times New Roman" w:cs="Times New Roman"/>
+          <w:szCs w:val="24"/>
+          <w:lang w:eastAsia="hu-HU"/>
+        </w:rPr>
+        <w:t xml:space="preserve">Összességében a projekt egy korszerű, valós problémára reflektáló megoldást kínál, amely a későbbiekben akár kereskedelmi irányba is </w:t>
+      </w:r>
+      <w:proofErr w:type="spellStart"/>
+      <w:r>
+        <w:rPr>
+          <w:rFonts w:eastAsia="Times New Roman" w:cs="Times New Roman"/>
+          <w:szCs w:val="24"/>
+          <w:lang w:eastAsia="hu-HU"/>
+        </w:rPr>
+        <w:t>továbbvihető</w:t>
+      </w:r>
+      <w:proofErr w:type="spellEnd"/>
+      <w:r>
+        <w:rPr>
+          <w:rFonts w:eastAsia="Times New Roman" w:cs="Times New Roman"/>
+          <w:szCs w:val="24"/>
+          <w:lang w:eastAsia="hu-HU"/>
+        </w:rPr>
+        <w:t>, megfelelő fejlesztések és támogatás mellett.</w:t>
+      </w:r>
+    </w:p>
+    <w:p/>
+    <w:p>
+      <w:pPr>
+        <w:spacing w:before="0" w:after="160" w:line="259" w:lineRule="auto"/>
+        <w:jc w:val="left"/>
+        <w:rPr>
+          <w:rFonts w:eastAsiaTheme="majorEastAsia" w:cstheme="majorBidi"/>
+          <w:b/>
+          <w:sz w:val="32"/>
+          <w:szCs w:val="32"/>
+        </w:rPr>
+      </w:pPr>
+      <w:bookmarkStart w:id="14" w:name="_Toc184887512"/>
+      <w:r>
+        <w:br w:type="page"/>
+      </w:r>
+    </w:p>
+    <w:p>
+      <w:pPr>
+        <w:pStyle w:val="Cmsor1"/>
+      </w:pPr>
+      <w:bookmarkStart w:id="15" w:name="_GoBack"/>
+      <w:bookmarkEnd w:id="15"/>
       <w:r>
         <w:lastRenderedPageBreak/>
-        <w:t>•</w:t>
-      </w:r>
-      <w:r>
-        <w:tab/>
-        <w:t xml:space="preserve">Ugyanakkor kerüld a laza stílust: rövidítések, </w:t>
-      </w:r>
-      <w:proofErr w:type="spellStart"/>
-      <w:r>
-        <w:t>smilie</w:t>
-      </w:r>
-      <w:proofErr w:type="spellEnd"/>
-      <w:r>
-        <w:t>-k, szleng kizárva.</w:t>
-      </w:r>
-    </w:p>
-    <w:p>
-      <w:r>
-        <w:t>•</w:t>
-      </w:r>
-      <w:r>
-        <w:tab/>
-        <w:t xml:space="preserve">Alkalmazz ábrákat, </w:t>
-      </w:r>
-      <w:proofErr w:type="spellStart"/>
-      <w:r>
-        <w:t>screenshot-</w:t>
-      </w:r>
-      <w:proofErr w:type="gramStart"/>
-      <w:r>
-        <w:t>okat</w:t>
-      </w:r>
-      <w:proofErr w:type="spellEnd"/>
-      <w:r>
-        <w:t xml:space="preserve"> ,</w:t>
-      </w:r>
-      <w:proofErr w:type="gramEnd"/>
-      <w:r>
-        <w:t xml:space="preserve"> de a ne legyen túlzott a képek aránya a szöveghez képest. </w:t>
-      </w:r>
-    </w:p>
-    <w:p>
-      <w:r>
-        <w:t>Ajánlott terjedelem: 1-</w:t>
-      </w:r>
-      <w:r>
-        <w:t>5</w:t>
-      </w:r>
-      <w:r>
-        <w:t xml:space="preserve"> oldal</w:t>
-      </w:r>
-    </w:p>
-    <w:p>
-      <w:pPr>
-        <w:pStyle w:val="Cmsor1"/>
-      </w:pPr>
-      <w:bookmarkStart w:id="14" w:name="_Toc184887511"/>
-      <w:r>
-        <w:t>Összegzés</w:t>
+        <w:t>Ábrajegyzék</w:t>
       </w:r>
       <w:bookmarkEnd w:id="14"/>
-    </w:p>
-    <w:p>
-      <w:r>
-        <w:t>Elérte-e a kitűzött célt, milyen további fejlesztési lehetőségeket lát.</w:t>
-      </w:r>
-    </w:p>
-    <w:p>
-      <w:pPr>
-        <w:pStyle w:val="Listaszerbekezds"/>
-        <w:numPr>
-          <w:ilvl w:val="0"/>
-          <w:numId w:val="10"/>
-        </w:numPr>
-      </w:pPr>
-      <w:r>
-        <w:t>Olyan ötletek, amelyeket meg akartál valósítani, de nem sikerült, vagy nem fért bele az időbe</w:t>
-      </w:r>
-    </w:p>
-    <w:p>
-      <w:pPr>
-        <w:pStyle w:val="Listaszerbekezds"/>
-        <w:numPr>
-          <w:ilvl w:val="0"/>
-          <w:numId w:val="10"/>
-        </w:numPr>
-      </w:pPr>
-      <w:r>
-        <w:t>Olyan ötletek, amelyeket még érdemes a jövőben megvalósítani</w:t>
-      </w:r>
-    </w:p>
-    <w:p>
-      <w:pPr>
-        <w:pStyle w:val="Cmsor1"/>
-      </w:pPr>
-      <w:bookmarkStart w:id="15" w:name="_Toc184887512"/>
-      <w:r>
-        <w:t>Ábrajegyzék</w:t>
-      </w:r>
-      <w:bookmarkEnd w:id="15"/>
     </w:p>
     <w:p>
       <w:r>
@@ -14048,6 +14890,119 @@
     </w:lvl>
   </w:abstractNum>
   <w:abstractNum w:abstractNumId="2" w15:restartNumberingAfterBreak="0">
+    <w:nsid w:val="1E583C9C"/>
+    <w:multiLevelType w:val="hybridMultilevel"/>
+    <w:tmpl w:val="D2D02DA4"/>
+    <w:lvl w:ilvl="0" w:tplc="040E0001">
+      <w:start w:val="1"/>
+      <w:numFmt w:val="bullet"/>
+      <w:lvlText w:val=""/>
+      <w:lvlJc w:val="left"/>
+      <w:pPr>
+        <w:ind w:left="720" w:hanging="360"/>
+      </w:pPr>
+      <w:rPr>
+        <w:rFonts w:ascii="Symbol" w:hAnsi="Symbol" w:hint="default"/>
+      </w:rPr>
+    </w:lvl>
+    <w:lvl w:ilvl="1" w:tplc="040E0003" w:tentative="1">
+      <w:start w:val="1"/>
+      <w:numFmt w:val="bullet"/>
+      <w:lvlText w:val="o"/>
+      <w:lvlJc w:val="left"/>
+      <w:pPr>
+        <w:ind w:left="1440" w:hanging="360"/>
+      </w:pPr>
+      <w:rPr>
+        <w:rFonts w:ascii="Courier New" w:hAnsi="Courier New" w:cs="Courier New" w:hint="default"/>
+      </w:rPr>
+    </w:lvl>
+    <w:lvl w:ilvl="2" w:tplc="040E0005" w:tentative="1">
+      <w:start w:val="1"/>
+      <w:numFmt w:val="bullet"/>
+      <w:lvlText w:val=""/>
+      <w:lvlJc w:val="left"/>
+      <w:pPr>
+        <w:ind w:left="2160" w:hanging="360"/>
+      </w:pPr>
+      <w:rPr>
+        <w:rFonts w:ascii="Wingdings" w:hAnsi="Wingdings" w:hint="default"/>
+      </w:rPr>
+    </w:lvl>
+    <w:lvl w:ilvl="3" w:tplc="040E0001" w:tentative="1">
+      <w:start w:val="1"/>
+      <w:numFmt w:val="bullet"/>
+      <w:lvlText w:val=""/>
+      <w:lvlJc w:val="left"/>
+      <w:pPr>
+        <w:ind w:left="2880" w:hanging="360"/>
+      </w:pPr>
+      <w:rPr>
+        <w:rFonts w:ascii="Symbol" w:hAnsi="Symbol" w:hint="default"/>
+      </w:rPr>
+    </w:lvl>
+    <w:lvl w:ilvl="4" w:tplc="040E0003" w:tentative="1">
+      <w:start w:val="1"/>
+      <w:numFmt w:val="bullet"/>
+      <w:lvlText w:val="o"/>
+      <w:lvlJc w:val="left"/>
+      <w:pPr>
+        <w:ind w:left="3600" w:hanging="360"/>
+      </w:pPr>
+      <w:rPr>
+        <w:rFonts w:ascii="Courier New" w:hAnsi="Courier New" w:cs="Courier New" w:hint="default"/>
+      </w:rPr>
+    </w:lvl>
+    <w:lvl w:ilvl="5" w:tplc="040E0005" w:tentative="1">
+      <w:start w:val="1"/>
+      <w:numFmt w:val="bullet"/>
+      <w:lvlText w:val=""/>
+      <w:lvlJc w:val="left"/>
+      <w:pPr>
+        <w:ind w:left="4320" w:hanging="360"/>
+      </w:pPr>
+      <w:rPr>
+        <w:rFonts w:ascii="Wingdings" w:hAnsi="Wingdings" w:hint="default"/>
+      </w:rPr>
+    </w:lvl>
+    <w:lvl w:ilvl="6" w:tplc="040E0001" w:tentative="1">
+      <w:start w:val="1"/>
+      <w:numFmt w:val="bullet"/>
+      <w:lvlText w:val=""/>
+      <w:lvlJc w:val="left"/>
+      <w:pPr>
+        <w:ind w:left="5040" w:hanging="360"/>
+      </w:pPr>
+      <w:rPr>
+        <w:rFonts w:ascii="Symbol" w:hAnsi="Symbol" w:hint="default"/>
+      </w:rPr>
+    </w:lvl>
+    <w:lvl w:ilvl="7" w:tplc="040E0003" w:tentative="1">
+      <w:start w:val="1"/>
+      <w:numFmt w:val="bullet"/>
+      <w:lvlText w:val="o"/>
+      <w:lvlJc w:val="left"/>
+      <w:pPr>
+        <w:ind w:left="5760" w:hanging="360"/>
+      </w:pPr>
+      <w:rPr>
+        <w:rFonts w:ascii="Courier New" w:hAnsi="Courier New" w:cs="Courier New" w:hint="default"/>
+      </w:rPr>
+    </w:lvl>
+    <w:lvl w:ilvl="8" w:tplc="040E0005" w:tentative="1">
+      <w:start w:val="1"/>
+      <w:numFmt w:val="bullet"/>
+      <w:lvlText w:val=""/>
+      <w:lvlJc w:val="left"/>
+      <w:pPr>
+        <w:ind w:left="6480" w:hanging="360"/>
+      </w:pPr>
+      <w:rPr>
+        <w:rFonts w:ascii="Wingdings" w:hAnsi="Wingdings" w:hint="default"/>
+      </w:rPr>
+    </w:lvl>
+  </w:abstractNum>
+  <w:abstractNum w:abstractNumId="3" w15:restartNumberingAfterBreak="0">
     <w:nsid w:val="2CC71388"/>
     <w:multiLevelType w:val="hybridMultilevel"/>
     <w:tmpl w:val="70B43C40"/>
@@ -14182,7 +15137,7 @@
       </w:pPr>
     </w:lvl>
   </w:abstractNum>
-  <w:abstractNum w:abstractNumId="3" w15:restartNumberingAfterBreak="0">
+  <w:abstractNum w:abstractNumId="4" w15:restartNumberingAfterBreak="0">
     <w:nsid w:val="38294BE5"/>
     <w:multiLevelType w:val="multilevel"/>
     <w:tmpl w:val="040E0021"/>
@@ -14295,7 +15250,7 @@
       </w:rPr>
     </w:lvl>
   </w:abstractNum>
-  <w:abstractNum w:abstractNumId="4" w15:restartNumberingAfterBreak="0">
+  <w:abstractNum w:abstractNumId="5" w15:restartNumberingAfterBreak="0">
     <w:nsid w:val="450C30F8"/>
     <w:multiLevelType w:val="hybridMultilevel"/>
     <w:tmpl w:val="A2287B8E"/>
@@ -14408,7 +15363,7 @@
       </w:rPr>
     </w:lvl>
   </w:abstractNum>
-  <w:abstractNum w:abstractNumId="5" w15:restartNumberingAfterBreak="0">
+  <w:abstractNum w:abstractNumId="6" w15:restartNumberingAfterBreak="0">
     <w:nsid w:val="4DCD09CC"/>
     <w:multiLevelType w:val="hybridMultilevel"/>
     <w:tmpl w:val="07F23C8C"/>
@@ -14494,7 +15449,120 @@
       </w:pPr>
     </w:lvl>
   </w:abstractNum>
-  <w:abstractNum w:abstractNumId="6" w15:restartNumberingAfterBreak="0">
+  <w:abstractNum w:abstractNumId="7" w15:restartNumberingAfterBreak="0">
+    <w:nsid w:val="4FD43C98"/>
+    <w:multiLevelType w:val="hybridMultilevel"/>
+    <w:tmpl w:val="95A67C36"/>
+    <w:lvl w:ilvl="0" w:tplc="040E0001">
+      <w:start w:val="1"/>
+      <w:numFmt w:val="bullet"/>
+      <w:lvlText w:val=""/>
+      <w:lvlJc w:val="left"/>
+      <w:pPr>
+        <w:ind w:left="720" w:hanging="360"/>
+      </w:pPr>
+      <w:rPr>
+        <w:rFonts w:ascii="Symbol" w:hAnsi="Symbol" w:hint="default"/>
+      </w:rPr>
+    </w:lvl>
+    <w:lvl w:ilvl="1" w:tplc="040E0003" w:tentative="1">
+      <w:start w:val="1"/>
+      <w:numFmt w:val="bullet"/>
+      <w:lvlText w:val="o"/>
+      <w:lvlJc w:val="left"/>
+      <w:pPr>
+        <w:ind w:left="1440" w:hanging="360"/>
+      </w:pPr>
+      <w:rPr>
+        <w:rFonts w:ascii="Courier New" w:hAnsi="Courier New" w:cs="Courier New" w:hint="default"/>
+      </w:rPr>
+    </w:lvl>
+    <w:lvl w:ilvl="2" w:tplc="040E0005" w:tentative="1">
+      <w:start w:val="1"/>
+      <w:numFmt w:val="bullet"/>
+      <w:lvlText w:val=""/>
+      <w:lvlJc w:val="left"/>
+      <w:pPr>
+        <w:ind w:left="2160" w:hanging="360"/>
+      </w:pPr>
+      <w:rPr>
+        <w:rFonts w:ascii="Wingdings" w:hAnsi="Wingdings" w:hint="default"/>
+      </w:rPr>
+    </w:lvl>
+    <w:lvl w:ilvl="3" w:tplc="040E0001" w:tentative="1">
+      <w:start w:val="1"/>
+      <w:numFmt w:val="bullet"/>
+      <w:lvlText w:val=""/>
+      <w:lvlJc w:val="left"/>
+      <w:pPr>
+        <w:ind w:left="2880" w:hanging="360"/>
+      </w:pPr>
+      <w:rPr>
+        <w:rFonts w:ascii="Symbol" w:hAnsi="Symbol" w:hint="default"/>
+      </w:rPr>
+    </w:lvl>
+    <w:lvl w:ilvl="4" w:tplc="040E0003" w:tentative="1">
+      <w:start w:val="1"/>
+      <w:numFmt w:val="bullet"/>
+      <w:lvlText w:val="o"/>
+      <w:lvlJc w:val="left"/>
+      <w:pPr>
+        <w:ind w:left="3600" w:hanging="360"/>
+      </w:pPr>
+      <w:rPr>
+        <w:rFonts w:ascii="Courier New" w:hAnsi="Courier New" w:cs="Courier New" w:hint="default"/>
+      </w:rPr>
+    </w:lvl>
+    <w:lvl w:ilvl="5" w:tplc="040E0005" w:tentative="1">
+      <w:start w:val="1"/>
+      <w:numFmt w:val="bullet"/>
+      <w:lvlText w:val=""/>
+      <w:lvlJc w:val="left"/>
+      <w:pPr>
+        <w:ind w:left="4320" w:hanging="360"/>
+      </w:pPr>
+      <w:rPr>
+        <w:rFonts w:ascii="Wingdings" w:hAnsi="Wingdings" w:hint="default"/>
+      </w:rPr>
+    </w:lvl>
+    <w:lvl w:ilvl="6" w:tplc="040E0001" w:tentative="1">
+      <w:start w:val="1"/>
+      <w:numFmt w:val="bullet"/>
+      <w:lvlText w:val=""/>
+      <w:lvlJc w:val="left"/>
+      <w:pPr>
+        <w:ind w:left="5040" w:hanging="360"/>
+      </w:pPr>
+      <w:rPr>
+        <w:rFonts w:ascii="Symbol" w:hAnsi="Symbol" w:hint="default"/>
+      </w:rPr>
+    </w:lvl>
+    <w:lvl w:ilvl="7" w:tplc="040E0003" w:tentative="1">
+      <w:start w:val="1"/>
+      <w:numFmt w:val="bullet"/>
+      <w:lvlText w:val="o"/>
+      <w:lvlJc w:val="left"/>
+      <w:pPr>
+        <w:ind w:left="5760" w:hanging="360"/>
+      </w:pPr>
+      <w:rPr>
+        <w:rFonts w:ascii="Courier New" w:hAnsi="Courier New" w:cs="Courier New" w:hint="default"/>
+      </w:rPr>
+    </w:lvl>
+    <w:lvl w:ilvl="8" w:tplc="040E0005" w:tentative="1">
+      <w:start w:val="1"/>
+      <w:numFmt w:val="bullet"/>
+      <w:lvlText w:val=""/>
+      <w:lvlJc w:val="left"/>
+      <w:pPr>
+        <w:ind w:left="6480" w:hanging="360"/>
+      </w:pPr>
+      <w:rPr>
+        <w:rFonts w:ascii="Wingdings" w:hAnsi="Wingdings" w:hint="default"/>
+      </w:rPr>
+    </w:lvl>
+  </w:abstractNum>
+  <w:abstractNum w:abstractNumId="8" w15:restartNumberingAfterBreak="0">
     <w:nsid w:val="4FF98D24"/>
     <w:multiLevelType w:val="hybridMultilevel"/>
     <w:tmpl w:val="B0809E32"/>
@@ -14580,7 +15648,120 @@
       </w:pPr>
     </w:lvl>
   </w:abstractNum>
-  <w:abstractNum w:abstractNumId="7" w15:restartNumberingAfterBreak="0">
+  <w:abstractNum w:abstractNumId="9" w15:restartNumberingAfterBreak="0">
+    <w:nsid w:val="535B0816"/>
+    <w:multiLevelType w:val="hybridMultilevel"/>
+    <w:tmpl w:val="E1F28F2C"/>
+    <w:lvl w:ilvl="0" w:tplc="040E0001">
+      <w:start w:val="1"/>
+      <w:numFmt w:val="bullet"/>
+      <w:lvlText w:val=""/>
+      <w:lvlJc w:val="left"/>
+      <w:pPr>
+        <w:ind w:left="720" w:hanging="360"/>
+      </w:pPr>
+      <w:rPr>
+        <w:rFonts w:ascii="Symbol" w:hAnsi="Symbol" w:hint="default"/>
+      </w:rPr>
+    </w:lvl>
+    <w:lvl w:ilvl="1" w:tplc="040E0003" w:tentative="1">
+      <w:start w:val="1"/>
+      <w:numFmt w:val="bullet"/>
+      <w:lvlText w:val="o"/>
+      <w:lvlJc w:val="left"/>
+      <w:pPr>
+        <w:ind w:left="1440" w:hanging="360"/>
+      </w:pPr>
+      <w:rPr>
+        <w:rFonts w:ascii="Courier New" w:hAnsi="Courier New" w:cs="Courier New" w:hint="default"/>
+      </w:rPr>
+    </w:lvl>
+    <w:lvl w:ilvl="2" w:tplc="040E0005" w:tentative="1">
+      <w:start w:val="1"/>
+      <w:numFmt w:val="bullet"/>
+      <w:lvlText w:val=""/>
+      <w:lvlJc w:val="left"/>
+      <w:pPr>
+        <w:ind w:left="2160" w:hanging="360"/>
+      </w:pPr>
+      <w:rPr>
+        <w:rFonts w:ascii="Wingdings" w:hAnsi="Wingdings" w:hint="default"/>
+      </w:rPr>
+    </w:lvl>
+    <w:lvl w:ilvl="3" w:tplc="040E0001" w:tentative="1">
+      <w:start w:val="1"/>
+      <w:numFmt w:val="bullet"/>
+      <w:lvlText w:val=""/>
+      <w:lvlJc w:val="left"/>
+      <w:pPr>
+        <w:ind w:left="2880" w:hanging="360"/>
+      </w:pPr>
+      <w:rPr>
+        <w:rFonts w:ascii="Symbol" w:hAnsi="Symbol" w:hint="default"/>
+      </w:rPr>
+    </w:lvl>
+    <w:lvl w:ilvl="4" w:tplc="040E0003" w:tentative="1">
+      <w:start w:val="1"/>
+      <w:numFmt w:val="bullet"/>
+      <w:lvlText w:val="o"/>
+      <w:lvlJc w:val="left"/>
+      <w:pPr>
+        <w:ind w:left="3600" w:hanging="360"/>
+      </w:pPr>
+      <w:rPr>
+        <w:rFonts w:ascii="Courier New" w:hAnsi="Courier New" w:cs="Courier New" w:hint="default"/>
+      </w:rPr>
+    </w:lvl>
+    <w:lvl w:ilvl="5" w:tplc="040E0005" w:tentative="1">
+      <w:start w:val="1"/>
+      <w:numFmt w:val="bullet"/>
+      <w:lvlText w:val=""/>
+      <w:lvlJc w:val="left"/>
+      <w:pPr>
+        <w:ind w:left="4320" w:hanging="360"/>
+      </w:pPr>
+      <w:rPr>
+        <w:rFonts w:ascii="Wingdings" w:hAnsi="Wingdings" w:hint="default"/>
+      </w:rPr>
+    </w:lvl>
+    <w:lvl w:ilvl="6" w:tplc="040E0001" w:tentative="1">
+      <w:start w:val="1"/>
+      <w:numFmt w:val="bullet"/>
+      <w:lvlText w:val=""/>
+      <w:lvlJc w:val="left"/>
+      <w:pPr>
+        <w:ind w:left="5040" w:hanging="360"/>
+      </w:pPr>
+      <w:rPr>
+        <w:rFonts w:ascii="Symbol" w:hAnsi="Symbol" w:hint="default"/>
+      </w:rPr>
+    </w:lvl>
+    <w:lvl w:ilvl="7" w:tplc="040E0003" w:tentative="1">
+      <w:start w:val="1"/>
+      <w:numFmt w:val="bullet"/>
+      <w:lvlText w:val="o"/>
+      <w:lvlJc w:val="left"/>
+      <w:pPr>
+        <w:ind w:left="5760" w:hanging="360"/>
+      </w:pPr>
+      <w:rPr>
+        <w:rFonts w:ascii="Courier New" w:hAnsi="Courier New" w:cs="Courier New" w:hint="default"/>
+      </w:rPr>
+    </w:lvl>
+    <w:lvl w:ilvl="8" w:tplc="040E0005" w:tentative="1">
+      <w:start w:val="1"/>
+      <w:numFmt w:val="bullet"/>
+      <w:lvlText w:val=""/>
+      <w:lvlJc w:val="left"/>
+      <w:pPr>
+        <w:ind w:left="6480" w:hanging="360"/>
+      </w:pPr>
+      <w:rPr>
+        <w:rFonts w:ascii="Wingdings" w:hAnsi="Wingdings" w:hint="default"/>
+      </w:rPr>
+    </w:lvl>
+  </w:abstractNum>
+  <w:abstractNum w:abstractNumId="10" w15:restartNumberingAfterBreak="0">
     <w:nsid w:val="56C9251A"/>
     <w:multiLevelType w:val="hybridMultilevel"/>
     <w:tmpl w:val="1B6666B2"/>
@@ -14693,7 +15874,7 @@
       </w:rPr>
     </w:lvl>
   </w:abstractNum>
-  <w:abstractNum w:abstractNumId="8" w15:restartNumberingAfterBreak="0">
+  <w:abstractNum w:abstractNumId="11" w15:restartNumberingAfterBreak="0">
     <w:nsid w:val="5C7C51B4"/>
     <w:multiLevelType w:val="hybridMultilevel"/>
     <w:tmpl w:val="455C474A"/>
@@ -14779,10 +15960,10 @@
       </w:pPr>
     </w:lvl>
   </w:abstractNum>
-  <w:abstractNum w:abstractNumId="9" w15:restartNumberingAfterBreak="0">
-    <w:nsid w:val="625659C6"/>
+  <w:abstractNum w:abstractNumId="12" w15:restartNumberingAfterBreak="0">
+    <w:nsid w:val="614738A4"/>
     <w:multiLevelType w:val="hybridMultilevel"/>
-    <w:tmpl w:val="6E8C759E"/>
+    <w:tmpl w:val="53F8A46C"/>
     <w:lvl w:ilvl="0" w:tplc="040E0001">
       <w:start w:val="1"/>
       <w:numFmt w:val="bullet"/>
@@ -14892,7 +16073,120 @@
       </w:rPr>
     </w:lvl>
   </w:abstractNum>
-  <w:abstractNum w:abstractNumId="10" w15:restartNumberingAfterBreak="0">
+  <w:abstractNum w:abstractNumId="13" w15:restartNumberingAfterBreak="0">
+    <w:nsid w:val="625659C6"/>
+    <w:multiLevelType w:val="hybridMultilevel"/>
+    <w:tmpl w:val="6E8C759E"/>
+    <w:lvl w:ilvl="0" w:tplc="040E0001">
+      <w:start w:val="1"/>
+      <w:numFmt w:val="bullet"/>
+      <w:lvlText w:val=""/>
+      <w:lvlJc w:val="left"/>
+      <w:pPr>
+        <w:ind w:left="720" w:hanging="360"/>
+      </w:pPr>
+      <w:rPr>
+        <w:rFonts w:ascii="Symbol" w:hAnsi="Symbol" w:hint="default"/>
+      </w:rPr>
+    </w:lvl>
+    <w:lvl w:ilvl="1" w:tplc="040E0003" w:tentative="1">
+      <w:start w:val="1"/>
+      <w:numFmt w:val="bullet"/>
+      <w:lvlText w:val="o"/>
+      <w:lvlJc w:val="left"/>
+      <w:pPr>
+        <w:ind w:left="1440" w:hanging="360"/>
+      </w:pPr>
+      <w:rPr>
+        <w:rFonts w:ascii="Courier New" w:hAnsi="Courier New" w:cs="Courier New" w:hint="default"/>
+      </w:rPr>
+    </w:lvl>
+    <w:lvl w:ilvl="2" w:tplc="040E0005" w:tentative="1">
+      <w:start w:val="1"/>
+      <w:numFmt w:val="bullet"/>
+      <w:lvlText w:val=""/>
+      <w:lvlJc w:val="left"/>
+      <w:pPr>
+        <w:ind w:left="2160" w:hanging="360"/>
+      </w:pPr>
+      <w:rPr>
+        <w:rFonts w:ascii="Wingdings" w:hAnsi="Wingdings" w:hint="default"/>
+      </w:rPr>
+    </w:lvl>
+    <w:lvl w:ilvl="3" w:tplc="040E0001" w:tentative="1">
+      <w:start w:val="1"/>
+      <w:numFmt w:val="bullet"/>
+      <w:lvlText w:val=""/>
+      <w:lvlJc w:val="left"/>
+      <w:pPr>
+        <w:ind w:left="2880" w:hanging="360"/>
+      </w:pPr>
+      <w:rPr>
+        <w:rFonts w:ascii="Symbol" w:hAnsi="Symbol" w:hint="default"/>
+      </w:rPr>
+    </w:lvl>
+    <w:lvl w:ilvl="4" w:tplc="040E0003" w:tentative="1">
+      <w:start w:val="1"/>
+      <w:numFmt w:val="bullet"/>
+      <w:lvlText w:val="o"/>
+      <w:lvlJc w:val="left"/>
+      <w:pPr>
+        <w:ind w:left="3600" w:hanging="360"/>
+      </w:pPr>
+      <w:rPr>
+        <w:rFonts w:ascii="Courier New" w:hAnsi="Courier New" w:cs="Courier New" w:hint="default"/>
+      </w:rPr>
+    </w:lvl>
+    <w:lvl w:ilvl="5" w:tplc="040E0005" w:tentative="1">
+      <w:start w:val="1"/>
+      <w:numFmt w:val="bullet"/>
+      <w:lvlText w:val=""/>
+      <w:lvlJc w:val="left"/>
+      <w:pPr>
+        <w:ind w:left="4320" w:hanging="360"/>
+      </w:pPr>
+      <w:rPr>
+        <w:rFonts w:ascii="Wingdings" w:hAnsi="Wingdings" w:hint="default"/>
+      </w:rPr>
+    </w:lvl>
+    <w:lvl w:ilvl="6" w:tplc="040E0001" w:tentative="1">
+      <w:start w:val="1"/>
+      <w:numFmt w:val="bullet"/>
+      <w:lvlText w:val=""/>
+      <w:lvlJc w:val="left"/>
+      <w:pPr>
+        <w:ind w:left="5040" w:hanging="360"/>
+      </w:pPr>
+      <w:rPr>
+        <w:rFonts w:ascii="Symbol" w:hAnsi="Symbol" w:hint="default"/>
+      </w:rPr>
+    </w:lvl>
+    <w:lvl w:ilvl="7" w:tplc="040E0003" w:tentative="1">
+      <w:start w:val="1"/>
+      <w:numFmt w:val="bullet"/>
+      <w:lvlText w:val="o"/>
+      <w:lvlJc w:val="left"/>
+      <w:pPr>
+        <w:ind w:left="5760" w:hanging="360"/>
+      </w:pPr>
+      <w:rPr>
+        <w:rFonts w:ascii="Courier New" w:hAnsi="Courier New" w:cs="Courier New" w:hint="default"/>
+      </w:rPr>
+    </w:lvl>
+    <w:lvl w:ilvl="8" w:tplc="040E0005" w:tentative="1">
+      <w:start w:val="1"/>
+      <w:numFmt w:val="bullet"/>
+      <w:lvlText w:val=""/>
+      <w:lvlJc w:val="left"/>
+      <w:pPr>
+        <w:ind w:left="6480" w:hanging="360"/>
+      </w:pPr>
+      <w:rPr>
+        <w:rFonts w:ascii="Wingdings" w:hAnsi="Wingdings" w:hint="default"/>
+      </w:rPr>
+    </w:lvl>
+  </w:abstractNum>
+  <w:abstractNum w:abstractNumId="14" w15:restartNumberingAfterBreak="0">
     <w:nsid w:val="634C2627"/>
     <w:multiLevelType w:val="hybridMultilevel"/>
     <w:tmpl w:val="A36AC1EC"/>
@@ -14981,7 +16275,7 @@
       </w:pPr>
     </w:lvl>
   </w:abstractNum>
-  <w:abstractNum w:abstractNumId="11" w15:restartNumberingAfterBreak="0">
+  <w:abstractNum w:abstractNumId="15" w15:restartNumberingAfterBreak="0">
     <w:nsid w:val="70B64A69"/>
     <w:multiLevelType w:val="hybridMultilevel"/>
     <w:tmpl w:val="41F81730"/>
@@ -15073,7 +16367,7 @@
       </w:pPr>
     </w:lvl>
   </w:abstractNum>
-  <w:abstractNum w:abstractNumId="12" w15:restartNumberingAfterBreak="0">
+  <w:abstractNum w:abstractNumId="16" w15:restartNumberingAfterBreak="0">
     <w:nsid w:val="743F65C1"/>
     <w:multiLevelType w:val="hybridMultilevel"/>
     <w:tmpl w:val="D08AD6E2"/>
@@ -15159,7 +16453,93 @@
       </w:pPr>
     </w:lvl>
   </w:abstractNum>
-  <w:abstractNum w:abstractNumId="13" w15:restartNumberingAfterBreak="0">
+  <w:abstractNum w:abstractNumId="17" w15:restartNumberingAfterBreak="0">
+    <w:nsid w:val="75726A1C"/>
+    <w:multiLevelType w:val="hybridMultilevel"/>
+    <w:tmpl w:val="05FE3432"/>
+    <w:lvl w:ilvl="0" w:tplc="040E000F">
+      <w:start w:val="1"/>
+      <w:numFmt w:val="decimal"/>
+      <w:lvlText w:val="%1."/>
+      <w:lvlJc w:val="left"/>
+      <w:pPr>
+        <w:ind w:left="720" w:hanging="360"/>
+      </w:pPr>
+    </w:lvl>
+    <w:lvl w:ilvl="1" w:tplc="040E0019" w:tentative="1">
+      <w:start w:val="1"/>
+      <w:numFmt w:val="lowerLetter"/>
+      <w:lvlText w:val="%2."/>
+      <w:lvlJc w:val="left"/>
+      <w:pPr>
+        <w:ind w:left="1440" w:hanging="360"/>
+      </w:pPr>
+    </w:lvl>
+    <w:lvl w:ilvl="2" w:tplc="040E001B" w:tentative="1">
+      <w:start w:val="1"/>
+      <w:numFmt w:val="lowerRoman"/>
+      <w:lvlText w:val="%3."/>
+      <w:lvlJc w:val="right"/>
+      <w:pPr>
+        <w:ind w:left="2160" w:hanging="180"/>
+      </w:pPr>
+    </w:lvl>
+    <w:lvl w:ilvl="3" w:tplc="040E000F" w:tentative="1">
+      <w:start w:val="1"/>
+      <w:numFmt w:val="decimal"/>
+      <w:lvlText w:val="%4."/>
+      <w:lvlJc w:val="left"/>
+      <w:pPr>
+        <w:ind w:left="2880" w:hanging="360"/>
+      </w:pPr>
+    </w:lvl>
+    <w:lvl w:ilvl="4" w:tplc="040E0019" w:tentative="1">
+      <w:start w:val="1"/>
+      <w:numFmt w:val="lowerLetter"/>
+      <w:lvlText w:val="%5."/>
+      <w:lvlJc w:val="left"/>
+      <w:pPr>
+        <w:ind w:left="3600" w:hanging="360"/>
+      </w:pPr>
+    </w:lvl>
+    <w:lvl w:ilvl="5" w:tplc="040E001B" w:tentative="1">
+      <w:start w:val="1"/>
+      <w:numFmt w:val="lowerRoman"/>
+      <w:lvlText w:val="%6."/>
+      <w:lvlJc w:val="right"/>
+      <w:pPr>
+        <w:ind w:left="4320" w:hanging="180"/>
+      </w:pPr>
+    </w:lvl>
+    <w:lvl w:ilvl="6" w:tplc="040E000F" w:tentative="1">
+      <w:start w:val="1"/>
+      <w:numFmt w:val="decimal"/>
+      <w:lvlText w:val="%7."/>
+      <w:lvlJc w:val="left"/>
+      <w:pPr>
+        <w:ind w:left="5040" w:hanging="360"/>
+      </w:pPr>
+    </w:lvl>
+    <w:lvl w:ilvl="7" w:tplc="040E0019" w:tentative="1">
+      <w:start w:val="1"/>
+      <w:numFmt w:val="lowerLetter"/>
+      <w:lvlText w:val="%8."/>
+      <w:lvlJc w:val="left"/>
+      <w:pPr>
+        <w:ind w:left="5760" w:hanging="360"/>
+      </w:pPr>
+    </w:lvl>
+    <w:lvl w:ilvl="8" w:tplc="040E001B" w:tentative="1">
+      <w:start w:val="1"/>
+      <w:numFmt w:val="lowerRoman"/>
+      <w:lvlText w:val="%9."/>
+      <w:lvlJc w:val="right"/>
+      <w:pPr>
+        <w:ind w:left="6480" w:hanging="180"/>
+      </w:pPr>
+    </w:lvl>
+  </w:abstractNum>
+  <w:abstractNum w:abstractNumId="18" w15:restartNumberingAfterBreak="0">
     <w:nsid w:val="7A032A56"/>
     <w:multiLevelType w:val="hybridMultilevel"/>
     <w:tmpl w:val="F4EED49A"/>
@@ -15247,58 +16627,73 @@
     </w:lvl>
   </w:abstractNum>
   <w:num w:numId="1">
-    <w:abstractNumId w:val="6"/>
+    <w:abstractNumId w:val="8"/>
   </w:num>
   <w:num w:numId="2">
-    <w:abstractNumId w:val="13"/>
+    <w:abstractNumId w:val="18"/>
   </w:num>
   <w:num w:numId="3">
-    <w:abstractNumId w:val="2"/>
+    <w:abstractNumId w:val="3"/>
   </w:num>
   <w:num w:numId="4">
-    <w:abstractNumId w:val="2"/>
+    <w:abstractNumId w:val="3"/>
     <w:lvlOverride w:ilvl="0">
       <w:startOverride w:val="1"/>
     </w:lvlOverride>
   </w:num>
   <w:num w:numId="5">
-    <w:abstractNumId w:val="4"/>
+    <w:abstractNumId w:val="5"/>
   </w:num>
   <w:num w:numId="6">
     <w:abstractNumId w:val="1"/>
   </w:num>
   <w:num w:numId="7">
-    <w:abstractNumId w:val="7"/>
+    <w:abstractNumId w:val="10"/>
   </w:num>
   <w:num w:numId="8">
-    <w:abstractNumId w:val="3"/>
+    <w:abstractNumId w:val="4"/>
   </w:num>
   <w:num w:numId="9">
-    <w:abstractNumId w:val="2"/>
+    <w:abstractNumId w:val="3"/>
     <w:lvlOverride w:ilvl="0">
       <w:startOverride w:val="1"/>
     </w:lvlOverride>
   </w:num>
   <w:num w:numId="10">
-    <w:abstractNumId w:val="9"/>
+    <w:abstractNumId w:val="13"/>
   </w:num>
   <w:num w:numId="11">
-    <w:abstractNumId w:val="12"/>
+    <w:abstractNumId w:val="16"/>
   </w:num>
   <w:num w:numId="12">
-    <w:abstractNumId w:val="8"/>
+    <w:abstractNumId w:val="11"/>
   </w:num>
   <w:num w:numId="13">
-    <w:abstractNumId w:val="5"/>
+    <w:abstractNumId w:val="6"/>
   </w:num>
   <w:num w:numId="14">
     <w:abstractNumId w:val="0"/>
   </w:num>
   <w:num w:numId="15">
-    <w:abstractNumId w:val="11"/>
+    <w:abstractNumId w:val="15"/>
   </w:num>
   <w:num w:numId="16">
-    <w:abstractNumId w:val="10"/>
+    <w:abstractNumId w:val="14"/>
+  </w:num>
+  <w:num w:numId="17">
+    <w:abstractNumId w:val="7"/>
+  </w:num>
+  <w:num w:numId="18">
+    <w:abstractNumId w:val="12"/>
+  </w:num>
+  <w:num w:numId="19">
+    <w:abstractNumId w:val="2"/>
+  </w:num>
+  <w:num w:numId="20">
+    <w:abstractNumId w:val="17"/>
+  </w:num>
+  <w:num w:numId="21">
+    <w:abstractNumId w:val="9"/>
   </w:num>
   <w:numIdMacAtCleanup w:val="16"/>
 </w:numbering>
@@ -15783,6 +17178,29 @@
       <w:szCs w:val="24"/>
     </w:rPr>
   </w:style>
+  <w:style w:type="paragraph" w:styleId="Cmsor4">
+    <w:name w:val="heading 4"/>
+    <w:basedOn w:val="Norml"/>
+    <w:next w:val="Norml"/>
+    <w:link w:val="Cmsor4Char"/>
+    <w:uiPriority w:val="9"/>
+    <w:semiHidden/>
+    <w:unhideWhenUsed/>
+    <w:qFormat/>
+    <w:rsid w:val="00660926"/>
+    <w:pPr>
+      <w:keepNext/>
+      <w:keepLines/>
+      <w:spacing w:before="40" w:after="0"/>
+      <w:outlineLvl w:val="3"/>
+    </w:pPr>
+    <w:rPr>
+      <w:rFonts w:asciiTheme="majorHAnsi" w:eastAsiaTheme="majorEastAsia" w:hAnsiTheme="majorHAnsi" w:cstheme="majorBidi"/>
+      <w:i/>
+      <w:iCs/>
+      <w:color w:val="2E74B5" w:themeColor="accent1" w:themeShade="BF"/>
+    </w:rPr>
+  </w:style>
   <w:style w:type="character" w:default="1" w:styleId="Bekezdsalapbettpusa">
     <w:name w:val="Default Paragraph Font"/>
     <w:uiPriority w:val="1"/>
@@ -15929,6 +17347,45 @@
       <w:color w:val="1F4D78" w:themeColor="accent1" w:themeShade="7F"/>
       <w:sz w:val="24"/>
       <w:szCs w:val="24"/>
+    </w:rPr>
+  </w:style>
+  <w:style w:type="character" w:customStyle="1" w:styleId="Cmsor4Char">
+    <w:name w:val="Címsor 4 Char"/>
+    <w:basedOn w:val="Bekezdsalapbettpusa"/>
+    <w:link w:val="Cmsor4"/>
+    <w:uiPriority w:val="9"/>
+    <w:semiHidden/>
+    <w:rsid w:val="00660926"/>
+    <w:rPr>
+      <w:rFonts w:asciiTheme="majorHAnsi" w:eastAsiaTheme="majorEastAsia" w:hAnsiTheme="majorHAnsi" w:cstheme="majorBidi"/>
+      <w:i/>
+      <w:iCs/>
+      <w:color w:val="2E74B5" w:themeColor="accent1" w:themeShade="BF"/>
+      <w:sz w:val="24"/>
+    </w:rPr>
+  </w:style>
+  <w:style w:type="character" w:styleId="Kiemels2">
+    <w:name w:val="Strong"/>
+    <w:basedOn w:val="Bekezdsalapbettpusa"/>
+    <w:uiPriority w:val="22"/>
+    <w:qFormat/>
+    <w:rsid w:val="00FF0EE2"/>
+    <w:rPr>
+      <w:b/>
+      <w:bCs/>
+    </w:rPr>
+  </w:style>
+  <w:style w:type="character" w:styleId="HTML-kd">
+    <w:name w:val="HTML Code"/>
+    <w:basedOn w:val="Bekezdsalapbettpusa"/>
+    <w:uiPriority w:val="99"/>
+    <w:semiHidden/>
+    <w:unhideWhenUsed/>
+    <w:rsid w:val="00641B8C"/>
+    <w:rPr>
+      <w:rFonts w:ascii="Courier New" w:eastAsia="Times New Roman" w:hAnsi="Courier New" w:cs="Courier New"/>
+      <w:sz w:val="20"/>
+      <w:szCs w:val="20"/>
     </w:rPr>
   </w:style>
 </w:styles>
@@ -16196,6 +17653,15 @@
 </file>
 
 <file path=customXml/item1.xml><?xml version="1.0" encoding="utf-8"?>
+<?mso-contentType ?>
+<FormTemplates xmlns="http://schemas.microsoft.com/sharepoint/v3/contenttype/forms">
+  <Display>DocumentLibraryForm</Display>
+  <Edit>DocumentLibraryForm</Edit>
+  <New>DocumentLibraryForm</New>
+</FormTemplates>
+</file>
+
+<file path=customXml/item2.xml><?xml version="1.0" encoding="utf-8"?>
 <ct:contentTypeSchema xmlns:ct="http://schemas.microsoft.com/office/2006/metadata/contentType" xmlns:ma="http://schemas.microsoft.com/office/2006/metadata/properties/metaAttributes" ct:_="" ma:_="" ma:contentTypeName="Dokumentum" ma:contentTypeID="0x010100D718D5B1F1F7ED478AB81686C56B3846" ma:contentTypeVersion="12" ma:contentTypeDescription="Új dokumentum létrehozása." ma:contentTypeScope="" ma:versionID="4113051e3749f108762f491873dd6f4a">
   <xsd:schema xmlns:xsd="http://www.w3.org/2001/XMLSchema" xmlns:xs="http://www.w3.org/2001/XMLSchema" xmlns:p="http://schemas.microsoft.com/office/2006/metadata/properties" xmlns:ns2="8147ea79-bac0-4e82-8ac5-0eadccd741d2" xmlns:ns3="60255030-76c1-42c3-809c-3af475a77e4b" targetNamespace="http://schemas.microsoft.com/office/2006/metadata/properties" ma:root="true" ma:fieldsID="b4ef00bff07f7ef5464b0f4fcee0641e" ns2:_="" ns3:_="">
     <xsd:import namespace="8147ea79-bac0-4e82-8ac5-0eadccd741d2"/>
@@ -16396,15 +17862,6 @@
 </ct:contentTypeSchema>
 </file>
 
-<file path=customXml/item2.xml><?xml version="1.0" encoding="utf-8"?>
-<?mso-contentType ?>
-<FormTemplates xmlns="http://schemas.microsoft.com/sharepoint/v3/contenttype/forms">
-  <Display>DocumentLibraryForm</Display>
-  <Edit>DocumentLibraryForm</Edit>
-  <New>DocumentLibraryForm</New>
-</FormTemplates>
-</file>
-
 <file path=customXml/item3.xml><?xml version="1.0" encoding="utf-8"?>
 <p:properties xmlns:p="http://schemas.microsoft.com/office/2006/metadata/properties" xmlns:xsi="http://www.w3.org/2001/XMLSchema-instance" xmlns:pc="http://schemas.microsoft.com/office/infopath/2007/PartnerControls">
   <documentManagement>
@@ -16422,6 +17879,14 @@
 </file>
 
 <file path=customXml/itemProps1.xml><?xml version="1.0" encoding="utf-8"?>
+<ds:datastoreItem xmlns:ds="http://schemas.openxmlformats.org/officeDocument/2006/customXml" ds:itemID="{79A7C881-0E9F-4ADE-9952-CE895C263EC3}">
+  <ds:schemaRefs>
+    <ds:schemaRef ds:uri="http://schemas.microsoft.com/sharepoint/v3/contenttype/forms"/>
+  </ds:schemaRefs>
+</ds:datastoreItem>
+</file>
+
+<file path=customXml/itemProps2.xml><?xml version="1.0" encoding="utf-8"?>
 <ds:datastoreItem xmlns:ds="http://schemas.openxmlformats.org/officeDocument/2006/customXml" ds:itemID="{506CB0D4-5899-457C-99D1-371F2417467A}">
   <ds:schemaRefs>
     <ds:schemaRef ds:uri="http://schemas.microsoft.com/office/2006/metadata/contentType"/>
@@ -16440,14 +17905,6 @@
 </ds:datastoreItem>
 </file>
 
-<file path=customXml/itemProps2.xml><?xml version="1.0" encoding="utf-8"?>
-<ds:datastoreItem xmlns:ds="http://schemas.openxmlformats.org/officeDocument/2006/customXml" ds:itemID="{79A7C881-0E9F-4ADE-9952-CE895C263EC3}">
-  <ds:schemaRefs>
-    <ds:schemaRef ds:uri="http://schemas.microsoft.com/sharepoint/v3/contenttype/forms"/>
-  </ds:schemaRefs>
-</ds:datastoreItem>
-</file>
-
 <file path=customXml/itemProps3.xml><?xml version="1.0" encoding="utf-8"?>
 <ds:datastoreItem xmlns:ds="http://schemas.openxmlformats.org/officeDocument/2006/customXml" ds:itemID="{B7E9051D-122B-41E4-9B50-07EAFD04DFCF}">
   <ds:schemaRefs>
@@ -16460,7 +17917,7 @@
 </file>
 
 <file path=customXml/itemProps4.xml><?xml version="1.0" encoding="utf-8"?>
-<ds:datastoreItem xmlns:ds="http://schemas.openxmlformats.org/officeDocument/2006/customXml" ds:itemID="{DFE88C67-CCA6-4BFB-B887-DC98F7105CE2}">
+<ds:datastoreItem xmlns:ds="http://schemas.openxmlformats.org/officeDocument/2006/customXml" ds:itemID="{644844C2-29D1-4CE6-B26E-0AA7E6DF47DB}">
   <ds:schemaRefs>
     <ds:schemaRef ds:uri="http://schemas.openxmlformats.org/officeDocument/2006/bibliography"/>
   </ds:schemaRefs>

</xml_diff>